<commit_message>
Added use case for 'Send Game Result'
</commit_message>
<xml_diff>
--- a/iteration1_deliverables/use_case_descriptions/use_case_descriptions.docx
+++ b/iteration1_deliverables/use_case_descriptions/use_case_descriptions.docx
@@ -3946,15 +3946,11 @@
         <w:pStyle w:val="Body"/>
         <w:rPr>
           <w:rFonts w:ascii="Arial" w:eastAsia="Arial" w:hAnsi="Arial" w:cs="Arial"/>
-          <w:sz w:val="25"/>
-          <w:szCs w:val="25"/>
-        </w:rPr>
-      </w:pPr>
-      <w:r>
-        <w:rPr>
-          <w:rFonts w:ascii="Arial" w:eastAsia="Arial" w:hAnsi="Arial" w:cs="Arial"/>
-          <w:sz w:val="25"/>
-          <w:szCs w:val="25"/>
+        </w:rPr>
+      </w:pPr>
+      <w:r>
+        <w:rPr>
+          <w:rFonts w:ascii="Arial" w:eastAsia="Arial" w:hAnsi="Arial" w:cs="Arial"/>
         </w:rPr>
         <w:lastRenderedPageBreak/>
         <w:t>Use case: End game (win/lose/quit)</w:t>
@@ -3965,25 +3961,19 @@
         <w:pStyle w:val="Body"/>
         <w:rPr>
           <w:rFonts w:ascii="Arial" w:eastAsia="Arial" w:hAnsi="Arial" w:cs="Arial"/>
-          <w:sz w:val="25"/>
-          <w:szCs w:val="25"/>
-        </w:rPr>
-      </w:pPr>
-    </w:p>
-    <w:p>
-      <w:pPr>
-        <w:pStyle w:val="Body"/>
-        <w:rPr>
-          <w:rFonts w:ascii="Arial" w:eastAsia="Arial" w:hAnsi="Arial" w:cs="Arial"/>
-          <w:sz w:val="25"/>
-          <w:szCs w:val="25"/>
-        </w:rPr>
-      </w:pPr>
-      <w:r>
-        <w:rPr>
-          <w:rFonts w:ascii="Arial" w:eastAsia="Arial" w:hAnsi="Arial" w:cs="Arial"/>
-          <w:sz w:val="25"/>
-          <w:szCs w:val="25"/>
+        </w:rPr>
+      </w:pPr>
+    </w:p>
+    <w:p>
+      <w:pPr>
+        <w:pStyle w:val="Body"/>
+        <w:rPr>
+          <w:rFonts w:ascii="Arial" w:eastAsia="Arial" w:hAnsi="Arial" w:cs="Arial"/>
+        </w:rPr>
+      </w:pPr>
+      <w:r>
+        <w:rPr>
+          <w:rFonts w:ascii="Arial" w:eastAsia="Arial" w:hAnsi="Arial" w:cs="Arial"/>
         </w:rPr>
         <w:t>Iteration: 1</w:t>
       </w:r>
@@ -3993,25 +3983,19 @@
         <w:pStyle w:val="Body"/>
         <w:rPr>
           <w:rFonts w:ascii="Arial" w:eastAsia="Arial" w:hAnsi="Arial" w:cs="Arial"/>
-          <w:sz w:val="25"/>
-          <w:szCs w:val="25"/>
-        </w:rPr>
-      </w:pPr>
-    </w:p>
-    <w:p>
-      <w:pPr>
-        <w:pStyle w:val="Body"/>
-        <w:rPr>
-          <w:rFonts w:ascii="Arial" w:eastAsia="Arial" w:hAnsi="Arial" w:cs="Arial"/>
-          <w:sz w:val="25"/>
-          <w:szCs w:val="25"/>
-        </w:rPr>
-      </w:pPr>
-      <w:r>
-        <w:rPr>
-          <w:rFonts w:ascii="Arial" w:eastAsia="Arial" w:hAnsi="Arial" w:cs="Arial"/>
-          <w:sz w:val="25"/>
-          <w:szCs w:val="25"/>
+        </w:rPr>
+      </w:pPr>
+    </w:p>
+    <w:p>
+      <w:pPr>
+        <w:pStyle w:val="Body"/>
+        <w:rPr>
+          <w:rFonts w:ascii="Arial" w:eastAsia="Arial" w:hAnsi="Arial" w:cs="Arial"/>
+        </w:rPr>
+      </w:pPr>
+      <w:r>
+        <w:rPr>
+          <w:rFonts w:ascii="Arial" w:eastAsia="Arial" w:hAnsi="Arial" w:cs="Arial"/>
         </w:rPr>
         <w:t>Primary Actor: Player</w:t>
       </w:r>
@@ -4021,25 +4005,19 @@
         <w:pStyle w:val="Body"/>
         <w:rPr>
           <w:rFonts w:ascii="Arial" w:eastAsia="Arial" w:hAnsi="Arial" w:cs="Arial"/>
-          <w:sz w:val="25"/>
-          <w:szCs w:val="25"/>
-        </w:rPr>
-      </w:pPr>
-    </w:p>
-    <w:p>
-      <w:pPr>
-        <w:pStyle w:val="Body"/>
-        <w:rPr>
-          <w:rFonts w:ascii="Arial" w:eastAsia="Arial" w:hAnsi="Arial" w:cs="Arial"/>
-          <w:sz w:val="25"/>
-          <w:szCs w:val="25"/>
-        </w:rPr>
-      </w:pPr>
-      <w:r>
-        <w:rPr>
-          <w:rFonts w:ascii="Arial" w:eastAsia="Arial" w:hAnsi="Arial" w:cs="Arial"/>
-          <w:sz w:val="25"/>
-          <w:szCs w:val="25"/>
+        </w:rPr>
+      </w:pPr>
+    </w:p>
+    <w:p>
+      <w:pPr>
+        <w:pStyle w:val="Body"/>
+        <w:rPr>
+          <w:rFonts w:ascii="Arial" w:eastAsia="Arial" w:hAnsi="Arial" w:cs="Arial"/>
+        </w:rPr>
+      </w:pPr>
+      <w:r>
+        <w:rPr>
+          <w:rFonts w:ascii="Arial" w:eastAsia="Arial" w:hAnsi="Arial" w:cs="Arial"/>
         </w:rPr>
         <w:t>Goal in context: To ensure the game session is concluded properly when a player wins, loses, or quits, updating the game state accordingly while allowing a short window for reconnection in case of disconnection.</w:t>
       </w:r>
@@ -4049,25 +4027,19 @@
         <w:pStyle w:val="Body"/>
         <w:rPr>
           <w:rFonts w:ascii="Arial" w:eastAsia="Arial" w:hAnsi="Arial" w:cs="Arial"/>
-          <w:sz w:val="25"/>
-          <w:szCs w:val="25"/>
-        </w:rPr>
-      </w:pPr>
-    </w:p>
-    <w:p>
-      <w:pPr>
-        <w:pStyle w:val="Body"/>
-        <w:rPr>
-          <w:rFonts w:ascii="Arial" w:eastAsia="Arial" w:hAnsi="Arial" w:cs="Arial"/>
-          <w:sz w:val="25"/>
-          <w:szCs w:val="25"/>
-        </w:rPr>
-      </w:pPr>
-      <w:r>
-        <w:rPr>
-          <w:rFonts w:ascii="Arial" w:eastAsia="Arial" w:hAnsi="Arial" w:cs="Arial"/>
-          <w:sz w:val="25"/>
-          <w:szCs w:val="25"/>
+        </w:rPr>
+      </w:pPr>
+    </w:p>
+    <w:p>
+      <w:pPr>
+        <w:pStyle w:val="Body"/>
+        <w:rPr>
+          <w:rFonts w:ascii="Arial" w:eastAsia="Arial" w:hAnsi="Arial" w:cs="Arial"/>
+        </w:rPr>
+      </w:pPr>
+      <w:r>
+        <w:rPr>
+          <w:rFonts w:ascii="Arial" w:eastAsia="Arial" w:hAnsi="Arial" w:cs="Arial"/>
         </w:rPr>
         <w:t>Preconditions:</w:t>
       </w:r>
@@ -4081,15 +4053,11 @@
         </w:numPr>
         <w:rPr>
           <w:rFonts w:ascii="Arial" w:eastAsia="Arial" w:hAnsi="Arial" w:cs="Arial"/>
-          <w:sz w:val="25"/>
-          <w:szCs w:val="25"/>
-        </w:rPr>
-      </w:pPr>
-      <w:r>
-        <w:rPr>
-          <w:rFonts w:ascii="Arial" w:eastAsia="Arial" w:hAnsi="Arial" w:cs="Arial"/>
-          <w:sz w:val="25"/>
-          <w:szCs w:val="25"/>
+        </w:rPr>
+      </w:pPr>
+      <w:r>
+        <w:rPr>
+          <w:rFonts w:ascii="Arial" w:eastAsia="Arial" w:hAnsi="Arial" w:cs="Arial"/>
         </w:rPr>
         <w:t>The player is logged into the game.</w:t>
       </w:r>
@@ -4103,15 +4071,11 @@
         </w:numPr>
         <w:rPr>
           <w:rFonts w:ascii="Arial" w:eastAsia="Arial" w:hAnsi="Arial" w:cs="Arial"/>
-          <w:sz w:val="25"/>
-          <w:szCs w:val="25"/>
-        </w:rPr>
-      </w:pPr>
-      <w:r>
-        <w:rPr>
-          <w:rFonts w:ascii="Arial" w:eastAsia="Arial" w:hAnsi="Arial" w:cs="Arial"/>
-          <w:sz w:val="25"/>
-          <w:szCs w:val="25"/>
+        </w:rPr>
+      </w:pPr>
+      <w:r>
+        <w:rPr>
+          <w:rFonts w:ascii="Arial" w:eastAsia="Arial" w:hAnsi="Arial" w:cs="Arial"/>
         </w:rPr>
         <w:t>The player is in an active game session.</w:t>
       </w:r>
@@ -4125,15 +4089,11 @@
         </w:numPr>
         <w:rPr>
           <w:rFonts w:ascii="Arial" w:eastAsia="Arial" w:hAnsi="Arial" w:cs="Arial"/>
-          <w:sz w:val="25"/>
-          <w:szCs w:val="25"/>
-        </w:rPr>
-      </w:pPr>
-      <w:r>
-        <w:rPr>
-          <w:rFonts w:ascii="Arial" w:eastAsia="Arial" w:hAnsi="Arial" w:cs="Arial"/>
-          <w:sz w:val="25"/>
-          <w:szCs w:val="25"/>
+        </w:rPr>
+      </w:pPr>
+      <w:r>
+        <w:rPr>
+          <w:rFonts w:ascii="Arial" w:eastAsia="Arial" w:hAnsi="Arial" w:cs="Arial"/>
         </w:rPr>
         <w:t>The game session has reached a win/loss condition, or a player has disconnected or quit.</w:t>
       </w:r>
@@ -4144,25 +4104,19 @@
         <w:ind w:left="720"/>
         <w:rPr>
           <w:rFonts w:ascii="Arial" w:eastAsia="Arial" w:hAnsi="Arial" w:cs="Arial"/>
-          <w:sz w:val="25"/>
-          <w:szCs w:val="25"/>
-        </w:rPr>
-      </w:pPr>
-    </w:p>
-    <w:p>
-      <w:pPr>
-        <w:pStyle w:val="Body"/>
-        <w:rPr>
-          <w:rFonts w:ascii="Arial" w:eastAsia="Arial" w:hAnsi="Arial" w:cs="Arial"/>
-          <w:sz w:val="25"/>
-          <w:szCs w:val="25"/>
-        </w:rPr>
-      </w:pPr>
-      <w:r>
-        <w:rPr>
-          <w:rFonts w:ascii="Arial" w:eastAsia="Arial" w:hAnsi="Arial" w:cs="Arial"/>
-          <w:sz w:val="25"/>
-          <w:szCs w:val="25"/>
+        </w:rPr>
+      </w:pPr>
+    </w:p>
+    <w:p>
+      <w:pPr>
+        <w:pStyle w:val="Body"/>
+        <w:rPr>
+          <w:rFonts w:ascii="Arial" w:eastAsia="Arial" w:hAnsi="Arial" w:cs="Arial"/>
+        </w:rPr>
+      </w:pPr>
+      <w:r>
+        <w:rPr>
+          <w:rFonts w:ascii="Arial" w:eastAsia="Arial" w:hAnsi="Arial" w:cs="Arial"/>
         </w:rPr>
         <w:t>Trigger:</w:t>
       </w:r>
@@ -4176,15 +4130,11 @@
         </w:numPr>
         <w:rPr>
           <w:rFonts w:ascii="Arial" w:eastAsia="Arial" w:hAnsi="Arial" w:cs="Arial"/>
-          <w:sz w:val="25"/>
-          <w:szCs w:val="25"/>
-        </w:rPr>
-      </w:pPr>
-      <w:r>
-        <w:rPr>
-          <w:rFonts w:ascii="Arial" w:eastAsia="Arial" w:hAnsi="Arial" w:cs="Arial"/>
-          <w:sz w:val="25"/>
-          <w:szCs w:val="25"/>
+        </w:rPr>
+      </w:pPr>
+      <w:r>
+        <w:rPr>
+          <w:rFonts w:ascii="Arial" w:eastAsia="Arial" w:hAnsi="Arial" w:cs="Arial"/>
         </w:rPr>
         <w:t>A player achieves a winning condition.</w:t>
       </w:r>
@@ -4198,15 +4148,11 @@
         </w:numPr>
         <w:rPr>
           <w:rFonts w:ascii="Arial" w:eastAsia="Arial" w:hAnsi="Arial" w:cs="Arial"/>
-          <w:sz w:val="25"/>
-          <w:szCs w:val="25"/>
-        </w:rPr>
-      </w:pPr>
-      <w:r>
-        <w:rPr>
-          <w:rFonts w:ascii="Arial" w:eastAsia="Arial" w:hAnsi="Arial" w:cs="Arial"/>
-          <w:sz w:val="25"/>
-          <w:szCs w:val="25"/>
+        </w:rPr>
+      </w:pPr>
+      <w:r>
+        <w:rPr>
+          <w:rFonts w:ascii="Arial" w:eastAsia="Arial" w:hAnsi="Arial" w:cs="Arial"/>
         </w:rPr>
         <w:t>A player manually quits the game.</w:t>
       </w:r>
@@ -4220,15 +4166,11 @@
         </w:numPr>
         <w:rPr>
           <w:rFonts w:ascii="Arial" w:eastAsia="Arial" w:hAnsi="Arial" w:cs="Arial"/>
-          <w:sz w:val="25"/>
-          <w:szCs w:val="25"/>
-        </w:rPr>
-      </w:pPr>
-      <w:r>
-        <w:rPr>
-          <w:rFonts w:ascii="Arial" w:eastAsia="Arial" w:hAnsi="Arial" w:cs="Arial"/>
-          <w:sz w:val="25"/>
-          <w:szCs w:val="25"/>
+        </w:rPr>
+      </w:pPr>
+      <w:r>
+        <w:rPr>
+          <w:rFonts w:ascii="Arial" w:eastAsia="Arial" w:hAnsi="Arial" w:cs="Arial"/>
         </w:rPr>
         <w:t>A player disconnects from the game.</w:t>
       </w:r>
@@ -4239,25 +4181,19 @@
         <w:ind w:left="720"/>
         <w:rPr>
           <w:rFonts w:ascii="Arial" w:eastAsia="Arial" w:hAnsi="Arial" w:cs="Arial"/>
-          <w:sz w:val="25"/>
-          <w:szCs w:val="25"/>
-        </w:rPr>
-      </w:pPr>
-    </w:p>
-    <w:p>
-      <w:pPr>
-        <w:pStyle w:val="Body"/>
-        <w:rPr>
-          <w:rFonts w:ascii="Arial" w:eastAsia="Arial" w:hAnsi="Arial" w:cs="Arial"/>
-          <w:sz w:val="25"/>
-          <w:szCs w:val="25"/>
-        </w:rPr>
-      </w:pPr>
-      <w:r>
-        <w:rPr>
-          <w:rFonts w:ascii="Arial" w:eastAsia="Arial" w:hAnsi="Arial" w:cs="Arial"/>
-          <w:sz w:val="25"/>
-          <w:szCs w:val="25"/>
+        </w:rPr>
+      </w:pPr>
+    </w:p>
+    <w:p>
+      <w:pPr>
+        <w:pStyle w:val="Body"/>
+        <w:rPr>
+          <w:rFonts w:ascii="Arial" w:eastAsia="Arial" w:hAnsi="Arial" w:cs="Arial"/>
+        </w:rPr>
+      </w:pPr>
+      <w:r>
+        <w:rPr>
+          <w:rFonts w:ascii="Arial" w:eastAsia="Arial" w:hAnsi="Arial" w:cs="Arial"/>
         </w:rPr>
         <w:t>Scenario:</w:t>
       </w:r>
@@ -4271,15 +4207,11 @@
         </w:numPr>
         <w:rPr>
           <w:rFonts w:ascii="Arial" w:eastAsia="Arial" w:hAnsi="Arial" w:cs="Arial"/>
-          <w:sz w:val="25"/>
-          <w:szCs w:val="25"/>
-        </w:rPr>
-      </w:pPr>
-      <w:r>
-        <w:rPr>
-          <w:rFonts w:ascii="Arial" w:eastAsia="Arial" w:hAnsi="Arial" w:cs="Arial"/>
-          <w:sz w:val="25"/>
-          <w:szCs w:val="25"/>
+        </w:rPr>
+      </w:pPr>
+      <w:r>
+        <w:rPr>
+          <w:rFonts w:ascii="Arial" w:eastAsia="Arial" w:hAnsi="Arial" w:cs="Arial"/>
         </w:rPr>
         <w:t>A player logs into the game platform.</w:t>
       </w:r>
@@ -4293,15 +4225,11 @@
         </w:numPr>
         <w:rPr>
           <w:rFonts w:ascii="Arial" w:eastAsia="Arial" w:hAnsi="Arial" w:cs="Arial"/>
-          <w:sz w:val="25"/>
-          <w:szCs w:val="25"/>
-        </w:rPr>
-      </w:pPr>
-      <w:r>
-        <w:rPr>
-          <w:rFonts w:ascii="Arial" w:eastAsia="Arial" w:hAnsi="Arial" w:cs="Arial"/>
-          <w:sz w:val="25"/>
-          <w:szCs w:val="25"/>
+        </w:rPr>
+      </w:pPr>
+      <w:r>
+        <w:rPr>
+          <w:rFonts w:ascii="Arial" w:eastAsia="Arial" w:hAnsi="Arial" w:cs="Arial"/>
         </w:rPr>
         <w:t>The player starts or joins an active game session.</w:t>
       </w:r>
@@ -4315,15 +4243,11 @@
         </w:numPr>
         <w:rPr>
           <w:rFonts w:ascii="Arial" w:eastAsia="Arial" w:hAnsi="Arial" w:cs="Arial"/>
-          <w:sz w:val="25"/>
-          <w:szCs w:val="25"/>
-        </w:rPr>
-      </w:pPr>
-      <w:r>
-        <w:rPr>
-          <w:rFonts w:ascii="Arial" w:eastAsia="Arial" w:hAnsi="Arial" w:cs="Arial"/>
-          <w:sz w:val="25"/>
-          <w:szCs w:val="25"/>
+        </w:rPr>
+      </w:pPr>
+      <w:r>
+        <w:rPr>
+          <w:rFonts w:ascii="Arial" w:eastAsia="Arial" w:hAnsi="Arial" w:cs="Arial"/>
         </w:rPr>
         <w:t xml:space="preserve">The game progresses until a win/loss condition is met (e.g. checkmate in </w:t>
       </w:r>
@@ -4331,8 +4255,6 @@
       <w:r>
         <w:rPr>
           <w:rFonts w:ascii="Arial" w:eastAsia="Arial" w:hAnsi="Arial" w:cs="Arial"/>
-          <w:sz w:val="25"/>
-          <w:szCs w:val="25"/>
         </w:rPr>
         <w:t>Chess</w:t>
       </w:r>
@@ -4340,26 +4262,8 @@
       <w:r>
         <w:rPr>
           <w:rFonts w:ascii="Arial" w:eastAsia="Arial" w:hAnsi="Arial" w:cs="Arial"/>
-          <w:sz w:val="25"/>
-          <w:szCs w:val="25"/>
-        </w:rPr>
-        <w:t xml:space="preserve"> or</w:t>
-      </w:r>
-      <w:r>
-        <w:rPr>
-          <w:rFonts w:ascii="Arial" w:eastAsia="Arial" w:hAnsi="Arial" w:cs="Arial"/>
-          <w:sz w:val="25"/>
-          <w:szCs w:val="25"/>
-        </w:rPr>
-        <w:t xml:space="preserve"> four in a row in Connect Four</w:t>
-      </w:r>
-      <w:r>
-        <w:rPr>
-          <w:rFonts w:ascii="Arial" w:eastAsia="Arial" w:hAnsi="Arial" w:cs="Arial"/>
-          <w:sz w:val="25"/>
-          <w:szCs w:val="25"/>
-        </w:rPr>
-        <w:t>).</w:t>
+        </w:rPr>
+        <w:t xml:space="preserve"> or four in a row in Connect Four).</w:t>
       </w:r>
     </w:p>
     <w:p>
@@ -4371,33 +4275,13 @@
         </w:numPr>
         <w:rPr>
           <w:rFonts w:ascii="Arial" w:eastAsia="Arial" w:hAnsi="Arial" w:cs="Arial"/>
-          <w:sz w:val="25"/>
-          <w:szCs w:val="25"/>
-        </w:rPr>
-      </w:pPr>
-      <w:r>
-        <w:rPr>
-          <w:rFonts w:ascii="Arial" w:eastAsia="Arial" w:hAnsi="Arial" w:cs="Arial"/>
-          <w:sz w:val="25"/>
-          <w:szCs w:val="25"/>
-        </w:rPr>
-        <w:t>The system detects the game</w:t>
-      </w:r>
-      <w:r>
-        <w:rPr>
-          <w:rFonts w:ascii="Arial" w:eastAsia="Arial" w:hAnsi="Arial" w:cs="Arial"/>
-          <w:sz w:val="25"/>
-          <w:szCs w:val="25"/>
-        </w:rPr>
-        <w:t xml:space="preserve"> </w:t>
-      </w:r>
-      <w:r>
-        <w:rPr>
-          <w:rFonts w:ascii="Arial" w:eastAsia="Arial" w:hAnsi="Arial" w:cs="Arial"/>
-          <w:sz w:val="25"/>
-          <w:szCs w:val="25"/>
-        </w:rPr>
-        <w:t>ending condition.</w:t>
+        </w:rPr>
+      </w:pPr>
+      <w:r>
+        <w:rPr>
+          <w:rFonts w:ascii="Arial" w:eastAsia="Arial" w:hAnsi="Arial" w:cs="Arial"/>
+        </w:rPr>
+        <w:t>The system detects the game ending condition.</w:t>
       </w:r>
     </w:p>
     <w:p>
@@ -4409,15 +4293,11 @@
         </w:numPr>
         <w:rPr>
           <w:rFonts w:ascii="Arial" w:eastAsia="Arial" w:hAnsi="Arial" w:cs="Arial"/>
-          <w:sz w:val="25"/>
-          <w:szCs w:val="25"/>
-        </w:rPr>
-      </w:pPr>
-      <w:r>
-        <w:rPr>
-          <w:rFonts w:ascii="Arial" w:eastAsia="Arial" w:hAnsi="Arial" w:cs="Arial"/>
-          <w:sz w:val="25"/>
-          <w:szCs w:val="25"/>
+        </w:rPr>
+      </w:pPr>
+      <w:r>
+        <w:rPr>
+          <w:rFonts w:ascii="Arial" w:eastAsia="Arial" w:hAnsi="Arial" w:cs="Arial"/>
         </w:rPr>
         <w:t xml:space="preserve">If a player manually quits or disconnects, the game </w:t>
       </w:r>
@@ -4425,8 +4305,6 @@
       <w:r>
         <w:rPr>
           <w:rFonts w:ascii="Arial" w:eastAsia="Arial" w:hAnsi="Arial" w:cs="Arial"/>
-          <w:sz w:val="25"/>
-          <w:szCs w:val="25"/>
         </w:rPr>
         <w:t>starts</w:t>
       </w:r>
@@ -4434,26 +4312,8 @@
       <w:r>
         <w:rPr>
           <w:rFonts w:ascii="Arial" w:eastAsia="Arial" w:hAnsi="Arial" w:cs="Arial"/>
-          <w:sz w:val="25"/>
-          <w:szCs w:val="25"/>
-        </w:rPr>
-        <w:t xml:space="preserve"> a reconnection timer (e.g. </w:t>
-      </w:r>
-      <w:r>
-        <w:rPr>
-          <w:rFonts w:ascii="Arial" w:eastAsia="Arial" w:hAnsi="Arial" w:cs="Arial"/>
-          <w:sz w:val="25"/>
-          <w:szCs w:val="25"/>
-        </w:rPr>
-        <w:t>3</w:t>
-      </w:r>
-      <w:r>
-        <w:rPr>
-          <w:rFonts w:ascii="Arial" w:eastAsia="Arial" w:hAnsi="Arial" w:cs="Arial"/>
-          <w:sz w:val="25"/>
-          <w:szCs w:val="25"/>
-        </w:rPr>
-        <w:t>0 seconds).</w:t>
+        </w:rPr>
+        <w:t xml:space="preserve"> a reconnection timer (e.g. 30 seconds).</w:t>
       </w:r>
     </w:p>
     <w:p>
@@ -4465,15 +4325,11 @@
         </w:numPr>
         <w:rPr>
           <w:rFonts w:ascii="Arial" w:eastAsia="Arial" w:hAnsi="Arial" w:cs="Arial"/>
-          <w:sz w:val="25"/>
-          <w:szCs w:val="25"/>
-        </w:rPr>
-      </w:pPr>
-      <w:r>
-        <w:rPr>
-          <w:rFonts w:ascii="Arial" w:eastAsia="Arial" w:hAnsi="Arial" w:cs="Arial"/>
-          <w:sz w:val="25"/>
-          <w:szCs w:val="25"/>
+        </w:rPr>
+      </w:pPr>
+      <w:r>
+        <w:rPr>
+          <w:rFonts w:ascii="Arial" w:eastAsia="Arial" w:hAnsi="Arial" w:cs="Arial"/>
         </w:rPr>
         <w:t>If the disconnected player reconnects within the time limit, they resume the game.</w:t>
       </w:r>
@@ -4487,15 +4343,11 @@
         </w:numPr>
         <w:rPr>
           <w:rFonts w:ascii="Arial" w:eastAsia="Arial" w:hAnsi="Arial" w:cs="Arial"/>
-          <w:sz w:val="25"/>
-          <w:szCs w:val="25"/>
-        </w:rPr>
-      </w:pPr>
-      <w:r>
-        <w:rPr>
-          <w:rFonts w:ascii="Arial" w:eastAsia="Arial" w:hAnsi="Arial" w:cs="Arial"/>
-          <w:sz w:val="25"/>
-          <w:szCs w:val="25"/>
+        </w:rPr>
+      </w:pPr>
+      <w:r>
+        <w:rPr>
+          <w:rFonts w:ascii="Arial" w:eastAsia="Arial" w:hAnsi="Arial" w:cs="Arial"/>
         </w:rPr>
         <w:t>If the player does not reconnect in time, the remaining player is declared the winner.</w:t>
       </w:r>
@@ -4509,15 +4361,11 @@
         </w:numPr>
         <w:rPr>
           <w:rFonts w:ascii="Arial" w:eastAsia="Arial" w:hAnsi="Arial" w:cs="Arial"/>
-          <w:sz w:val="25"/>
-          <w:szCs w:val="25"/>
-        </w:rPr>
-      </w:pPr>
-      <w:r>
-        <w:rPr>
-          <w:rFonts w:ascii="Arial" w:eastAsia="Arial" w:hAnsi="Arial" w:cs="Arial"/>
-          <w:sz w:val="25"/>
-          <w:szCs w:val="25"/>
+        </w:rPr>
+      </w:pPr>
+      <w:r>
+        <w:rPr>
+          <w:rFonts w:ascii="Arial" w:eastAsia="Arial" w:hAnsi="Arial" w:cs="Arial"/>
         </w:rPr>
         <w:t>The system prepares to send the game results to the server.</w:t>
       </w:r>
@@ -4528,25 +4376,19 @@
         <w:ind w:left="720"/>
         <w:rPr>
           <w:rFonts w:ascii="Arial" w:eastAsia="Arial" w:hAnsi="Arial" w:cs="Arial"/>
-          <w:sz w:val="25"/>
-          <w:szCs w:val="25"/>
-        </w:rPr>
-      </w:pPr>
-    </w:p>
-    <w:p>
-      <w:pPr>
-        <w:pStyle w:val="Body"/>
-        <w:rPr>
-          <w:rFonts w:ascii="Arial" w:eastAsia="Arial" w:hAnsi="Arial" w:cs="Arial"/>
-          <w:sz w:val="25"/>
-          <w:szCs w:val="25"/>
-        </w:rPr>
-      </w:pPr>
-      <w:r>
-        <w:rPr>
-          <w:rFonts w:ascii="Arial" w:eastAsia="Arial" w:hAnsi="Arial" w:cs="Arial"/>
-          <w:sz w:val="25"/>
-          <w:szCs w:val="25"/>
+        </w:rPr>
+      </w:pPr>
+    </w:p>
+    <w:p>
+      <w:pPr>
+        <w:pStyle w:val="Body"/>
+        <w:rPr>
+          <w:rFonts w:ascii="Arial" w:eastAsia="Arial" w:hAnsi="Arial" w:cs="Arial"/>
+        </w:rPr>
+      </w:pPr>
+      <w:r>
+        <w:rPr>
+          <w:rFonts w:ascii="Arial" w:eastAsia="Arial" w:hAnsi="Arial" w:cs="Arial"/>
         </w:rPr>
         <w:t>Post conditions:</w:t>
       </w:r>
@@ -4560,15 +4402,11 @@
         </w:numPr>
         <w:rPr>
           <w:rFonts w:ascii="Arial" w:eastAsia="Arial" w:hAnsi="Arial" w:cs="Arial"/>
-          <w:sz w:val="25"/>
-          <w:szCs w:val="25"/>
-        </w:rPr>
-      </w:pPr>
-      <w:r>
-        <w:rPr>
-          <w:rFonts w:ascii="Arial" w:eastAsia="Arial" w:hAnsi="Arial" w:cs="Arial"/>
-          <w:sz w:val="25"/>
-          <w:szCs w:val="25"/>
+        </w:rPr>
+      </w:pPr>
+      <w:r>
+        <w:rPr>
+          <w:rFonts w:ascii="Arial" w:eastAsia="Arial" w:hAnsi="Arial" w:cs="Arial"/>
         </w:rPr>
         <w:t>The game is officially marked as finished.</w:t>
       </w:r>
@@ -4582,15 +4420,11 @@
         </w:numPr>
         <w:rPr>
           <w:rFonts w:ascii="Arial" w:eastAsia="Arial" w:hAnsi="Arial" w:cs="Arial"/>
-          <w:sz w:val="25"/>
-          <w:szCs w:val="25"/>
-        </w:rPr>
-      </w:pPr>
-      <w:r>
-        <w:rPr>
-          <w:rFonts w:ascii="Arial" w:eastAsia="Arial" w:hAnsi="Arial" w:cs="Arial"/>
-          <w:sz w:val="25"/>
-          <w:szCs w:val="25"/>
+        </w:rPr>
+      </w:pPr>
+      <w:r>
+        <w:rPr>
+          <w:rFonts w:ascii="Arial" w:eastAsia="Arial" w:hAnsi="Arial" w:cs="Arial"/>
         </w:rPr>
         <w:t>The winner and loser are determined based on the final game state or disconnection timeout.</w:t>
       </w:r>
@@ -4604,15 +4438,11 @@
         </w:numPr>
         <w:rPr>
           <w:rFonts w:ascii="Arial" w:eastAsia="Arial" w:hAnsi="Arial" w:cs="Arial"/>
-          <w:sz w:val="25"/>
-          <w:szCs w:val="25"/>
-        </w:rPr>
-      </w:pPr>
-      <w:r>
-        <w:rPr>
-          <w:rFonts w:ascii="Arial" w:eastAsia="Arial" w:hAnsi="Arial" w:cs="Arial"/>
-          <w:sz w:val="25"/>
-          <w:szCs w:val="25"/>
+        </w:rPr>
+      </w:pPr>
+      <w:r>
+        <w:rPr>
+          <w:rFonts w:ascii="Arial" w:eastAsia="Arial" w:hAnsi="Arial" w:cs="Arial"/>
         </w:rPr>
         <w:t>The match result is recorded and prepared for leaderboard updates.</w:t>
       </w:r>
@@ -4623,25 +4453,19 @@
         <w:ind w:left="720"/>
         <w:rPr>
           <w:rFonts w:ascii="Arial" w:eastAsia="Arial" w:hAnsi="Arial" w:cs="Arial"/>
-          <w:sz w:val="25"/>
-          <w:szCs w:val="25"/>
-        </w:rPr>
-      </w:pPr>
-    </w:p>
-    <w:p>
-      <w:pPr>
-        <w:pStyle w:val="Body"/>
-        <w:rPr>
-          <w:rFonts w:ascii="Arial" w:eastAsia="Arial" w:hAnsi="Arial" w:cs="Arial"/>
-          <w:sz w:val="25"/>
-          <w:szCs w:val="25"/>
-        </w:rPr>
-      </w:pPr>
-      <w:r>
-        <w:rPr>
-          <w:rFonts w:ascii="Arial" w:eastAsia="Arial" w:hAnsi="Arial" w:cs="Arial"/>
-          <w:sz w:val="25"/>
-          <w:szCs w:val="25"/>
+        </w:rPr>
+      </w:pPr>
+    </w:p>
+    <w:p>
+      <w:pPr>
+        <w:pStyle w:val="Body"/>
+        <w:rPr>
+          <w:rFonts w:ascii="Arial" w:eastAsia="Arial" w:hAnsi="Arial" w:cs="Arial"/>
+        </w:rPr>
+      </w:pPr>
+      <w:r>
+        <w:rPr>
+          <w:rFonts w:ascii="Arial" w:eastAsia="Arial" w:hAnsi="Arial" w:cs="Arial"/>
         </w:rPr>
         <w:t>Exceptions:</w:t>
       </w:r>
@@ -4655,15 +4479,11 @@
         </w:numPr>
         <w:rPr>
           <w:rFonts w:ascii="Arial" w:eastAsia="Arial" w:hAnsi="Arial" w:cs="Arial"/>
-          <w:sz w:val="25"/>
-          <w:szCs w:val="25"/>
-        </w:rPr>
-      </w:pPr>
-      <w:r>
-        <w:rPr>
-          <w:rFonts w:ascii="Arial" w:eastAsia="Arial" w:hAnsi="Arial" w:cs="Arial"/>
-          <w:sz w:val="25"/>
-          <w:szCs w:val="25"/>
+        </w:rPr>
+      </w:pPr>
+      <w:r>
+        <w:rPr>
+          <w:rFonts w:ascii="Arial" w:eastAsia="Arial" w:hAnsi="Arial" w:cs="Arial"/>
         </w:rPr>
         <w:t>A server error prevents the match result from being updated.</w:t>
       </w:r>
@@ -4677,15 +4497,11 @@
         </w:numPr>
         <w:rPr>
           <w:rFonts w:ascii="Arial" w:eastAsia="Arial" w:hAnsi="Arial" w:cs="Arial"/>
-          <w:sz w:val="25"/>
-          <w:szCs w:val="25"/>
-        </w:rPr>
-      </w:pPr>
-      <w:r>
-        <w:rPr>
-          <w:rFonts w:ascii="Arial" w:eastAsia="Arial" w:hAnsi="Arial" w:cs="Arial"/>
-          <w:sz w:val="25"/>
-          <w:szCs w:val="25"/>
+        </w:rPr>
+      </w:pPr>
+      <w:r>
+        <w:rPr>
+          <w:rFonts w:ascii="Arial" w:eastAsia="Arial" w:hAnsi="Arial" w:cs="Arial"/>
         </w:rPr>
         <w:t>A player disputes the match result due to a network issue.</w:t>
       </w:r>
@@ -4696,27 +4512,20 @@
         <w:ind w:left="720"/>
         <w:rPr>
           <w:rFonts w:ascii="Arial" w:eastAsia="Arial" w:hAnsi="Arial" w:cs="Arial"/>
-          <w:sz w:val="25"/>
-          <w:szCs w:val="25"/>
-        </w:rPr>
-      </w:pPr>
-    </w:p>
-    <w:p>
-      <w:pPr>
-        <w:pStyle w:val="Body"/>
-        <w:rPr>
-          <w:rFonts w:ascii="Arial" w:eastAsia="Arial" w:hAnsi="Arial" w:cs="Arial"/>
-          <w:sz w:val="25"/>
-          <w:szCs w:val="25"/>
-        </w:rPr>
-      </w:pPr>
-      <w:r>
-        <w:rPr>
-          <w:rFonts w:ascii="Arial" w:eastAsia="Arial" w:hAnsi="Arial" w:cs="Arial"/>
-          <w:sz w:val="25"/>
-          <w:szCs w:val="25"/>
-        </w:rPr>
-        <w:lastRenderedPageBreak/>
+        </w:rPr>
+      </w:pPr>
+    </w:p>
+    <w:p>
+      <w:pPr>
+        <w:pStyle w:val="Body"/>
+        <w:rPr>
+          <w:rFonts w:ascii="Arial" w:eastAsia="Arial" w:hAnsi="Arial" w:cs="Arial"/>
+        </w:rPr>
+      </w:pPr>
+      <w:r>
+        <w:rPr>
+          <w:rFonts w:ascii="Arial" w:eastAsia="Arial" w:hAnsi="Arial" w:cs="Arial"/>
+        </w:rPr>
         <w:t>Priority: High (Ensures a fair and smooth conclusion to each game session).</w:t>
       </w:r>
     </w:p>
@@ -4725,25 +4534,19 @@
         <w:pStyle w:val="Body"/>
         <w:rPr>
           <w:rFonts w:ascii="Arial" w:eastAsia="Arial" w:hAnsi="Arial" w:cs="Arial"/>
-          <w:sz w:val="25"/>
-          <w:szCs w:val="25"/>
-        </w:rPr>
-      </w:pPr>
-    </w:p>
-    <w:p>
-      <w:pPr>
-        <w:pStyle w:val="Body"/>
-        <w:rPr>
-          <w:rFonts w:ascii="Arial" w:eastAsia="Arial" w:hAnsi="Arial" w:cs="Arial"/>
-          <w:sz w:val="25"/>
-          <w:szCs w:val="25"/>
-        </w:rPr>
-      </w:pPr>
-      <w:r>
-        <w:rPr>
-          <w:rFonts w:ascii="Arial" w:eastAsia="Arial" w:hAnsi="Arial" w:cs="Arial"/>
-          <w:sz w:val="25"/>
-          <w:szCs w:val="25"/>
+        </w:rPr>
+      </w:pPr>
+    </w:p>
+    <w:p>
+      <w:pPr>
+        <w:pStyle w:val="Body"/>
+        <w:rPr>
+          <w:rFonts w:ascii="Arial" w:eastAsia="Arial" w:hAnsi="Arial" w:cs="Arial"/>
+        </w:rPr>
+      </w:pPr>
+      <w:r>
+        <w:rPr>
+          <w:rFonts w:ascii="Arial" w:eastAsia="Arial" w:hAnsi="Arial" w:cs="Arial"/>
         </w:rPr>
         <w:t>When available: 3rd iteration</w:t>
       </w:r>
@@ -4753,25 +4556,19 @@
         <w:pStyle w:val="Body"/>
         <w:rPr>
           <w:rFonts w:ascii="Arial" w:eastAsia="Arial" w:hAnsi="Arial" w:cs="Arial"/>
-          <w:sz w:val="25"/>
-          <w:szCs w:val="25"/>
-        </w:rPr>
-      </w:pPr>
-    </w:p>
-    <w:p>
-      <w:pPr>
-        <w:pStyle w:val="Body"/>
-        <w:rPr>
-          <w:rFonts w:ascii="Arial" w:eastAsia="Arial" w:hAnsi="Arial" w:cs="Arial"/>
-          <w:sz w:val="25"/>
-          <w:szCs w:val="25"/>
-        </w:rPr>
-      </w:pPr>
-      <w:r>
-        <w:rPr>
-          <w:rFonts w:ascii="Arial" w:eastAsia="Arial" w:hAnsi="Arial" w:cs="Arial"/>
-          <w:sz w:val="25"/>
-          <w:szCs w:val="25"/>
+        </w:rPr>
+      </w:pPr>
+    </w:p>
+    <w:p>
+      <w:pPr>
+        <w:pStyle w:val="Body"/>
+        <w:rPr>
+          <w:rFonts w:ascii="Arial" w:eastAsia="Arial" w:hAnsi="Arial" w:cs="Arial"/>
+        </w:rPr>
+      </w:pPr>
+      <w:r>
+        <w:rPr>
+          <w:rFonts w:ascii="Arial" w:eastAsia="Arial" w:hAnsi="Arial" w:cs="Arial"/>
         </w:rPr>
         <w:t>Frequency of use: High (Occurs at the end of every game session).</w:t>
       </w:r>
@@ -4781,25 +4578,19 @@
         <w:pStyle w:val="Body"/>
         <w:rPr>
           <w:rFonts w:ascii="Arial" w:eastAsia="Arial" w:hAnsi="Arial" w:cs="Arial"/>
-          <w:sz w:val="25"/>
-          <w:szCs w:val="25"/>
-        </w:rPr>
-      </w:pPr>
-    </w:p>
-    <w:p>
-      <w:pPr>
-        <w:pStyle w:val="Body"/>
-        <w:rPr>
-          <w:rFonts w:ascii="Arial" w:eastAsia="Arial" w:hAnsi="Arial" w:cs="Arial"/>
-          <w:sz w:val="25"/>
-          <w:szCs w:val="25"/>
-        </w:rPr>
-      </w:pPr>
-      <w:r>
-        <w:rPr>
-          <w:rFonts w:ascii="Arial" w:eastAsia="Arial" w:hAnsi="Arial" w:cs="Arial"/>
-          <w:sz w:val="25"/>
-          <w:szCs w:val="25"/>
+        </w:rPr>
+      </w:pPr>
+    </w:p>
+    <w:p>
+      <w:pPr>
+        <w:pStyle w:val="Body"/>
+        <w:rPr>
+          <w:rFonts w:ascii="Arial" w:eastAsia="Arial" w:hAnsi="Arial" w:cs="Arial"/>
+        </w:rPr>
+      </w:pPr>
+      <w:r>
+        <w:rPr>
+          <w:rFonts w:ascii="Arial" w:eastAsia="Arial" w:hAnsi="Arial" w:cs="Arial"/>
         </w:rPr>
         <w:t>Channel to actor: Screen, game interface</w:t>
       </w:r>
@@ -4809,25 +4600,19 @@
         <w:pStyle w:val="Body"/>
         <w:rPr>
           <w:rFonts w:ascii="Arial" w:eastAsia="Arial" w:hAnsi="Arial" w:cs="Arial"/>
-          <w:sz w:val="25"/>
-          <w:szCs w:val="25"/>
-        </w:rPr>
-      </w:pPr>
-    </w:p>
-    <w:p>
-      <w:pPr>
-        <w:pStyle w:val="Body"/>
-        <w:rPr>
-          <w:rFonts w:ascii="Arial" w:eastAsia="Arial" w:hAnsi="Arial" w:cs="Arial"/>
-          <w:sz w:val="25"/>
-          <w:szCs w:val="25"/>
-        </w:rPr>
-      </w:pPr>
-      <w:r>
-        <w:rPr>
-          <w:rFonts w:ascii="Arial" w:eastAsia="Arial" w:hAnsi="Arial" w:cs="Arial"/>
-          <w:sz w:val="25"/>
-          <w:szCs w:val="25"/>
+        </w:rPr>
+      </w:pPr>
+    </w:p>
+    <w:p>
+      <w:pPr>
+        <w:pStyle w:val="Body"/>
+        <w:rPr>
+          <w:rFonts w:ascii="Arial" w:eastAsia="Arial" w:hAnsi="Arial" w:cs="Arial"/>
+        </w:rPr>
+      </w:pPr>
+      <w:r>
+        <w:rPr>
+          <w:rFonts w:ascii="Arial" w:eastAsia="Arial" w:hAnsi="Arial" w:cs="Arial"/>
         </w:rPr>
         <w:t>Secondary actors: Game server</w:t>
       </w:r>
@@ -4837,25 +4622,19 @@
         <w:pStyle w:val="Body"/>
         <w:rPr>
           <w:rFonts w:ascii="Arial" w:eastAsia="Arial" w:hAnsi="Arial" w:cs="Arial"/>
-          <w:sz w:val="25"/>
-          <w:szCs w:val="25"/>
-        </w:rPr>
-      </w:pPr>
-    </w:p>
-    <w:p>
-      <w:pPr>
-        <w:pStyle w:val="Body"/>
-        <w:rPr>
-          <w:rFonts w:ascii="Arial" w:eastAsia="Arial" w:hAnsi="Arial" w:cs="Arial"/>
-          <w:sz w:val="25"/>
-          <w:szCs w:val="25"/>
-        </w:rPr>
-      </w:pPr>
-      <w:r>
-        <w:rPr>
-          <w:rFonts w:ascii="Arial" w:eastAsia="Arial" w:hAnsi="Arial" w:cs="Arial"/>
-          <w:sz w:val="25"/>
-          <w:szCs w:val="25"/>
+        </w:rPr>
+      </w:pPr>
+    </w:p>
+    <w:p>
+      <w:pPr>
+        <w:pStyle w:val="Body"/>
+        <w:rPr>
+          <w:rFonts w:ascii="Arial" w:eastAsia="Arial" w:hAnsi="Arial" w:cs="Arial"/>
+        </w:rPr>
+      </w:pPr>
+      <w:r>
+        <w:rPr>
+          <w:rFonts w:ascii="Arial" w:eastAsia="Arial" w:hAnsi="Arial" w:cs="Arial"/>
         </w:rPr>
         <w:t>Channel to secondary actors: Network connection</w:t>
       </w:r>
@@ -4865,25 +4644,19 @@
         <w:pStyle w:val="Body"/>
         <w:rPr>
           <w:rFonts w:ascii="Arial" w:eastAsia="Arial" w:hAnsi="Arial" w:cs="Arial"/>
-          <w:sz w:val="25"/>
-          <w:szCs w:val="25"/>
-        </w:rPr>
-      </w:pPr>
-    </w:p>
-    <w:p>
-      <w:pPr>
-        <w:pStyle w:val="Body"/>
-        <w:rPr>
-          <w:rFonts w:ascii="Arial" w:eastAsia="Arial" w:hAnsi="Arial" w:cs="Arial"/>
-          <w:sz w:val="25"/>
-          <w:szCs w:val="25"/>
-        </w:rPr>
-      </w:pPr>
-      <w:r>
-        <w:rPr>
-          <w:rFonts w:ascii="Arial" w:eastAsia="Arial" w:hAnsi="Arial" w:cs="Arial"/>
-          <w:sz w:val="25"/>
-          <w:szCs w:val="25"/>
+        </w:rPr>
+      </w:pPr>
+    </w:p>
+    <w:p>
+      <w:pPr>
+        <w:pStyle w:val="Body"/>
+        <w:rPr>
+          <w:rFonts w:ascii="Arial" w:eastAsia="Arial" w:hAnsi="Arial" w:cs="Arial"/>
+        </w:rPr>
+      </w:pPr>
+      <w:r>
+        <w:rPr>
+          <w:rFonts w:ascii="Arial" w:eastAsia="Arial" w:hAnsi="Arial" w:cs="Arial"/>
         </w:rPr>
         <w:t>Open issues:</w:t>
       </w:r>
@@ -4897,15 +4670,11 @@
         </w:numPr>
         <w:rPr>
           <w:rFonts w:ascii="Arial" w:eastAsia="Arial" w:hAnsi="Arial" w:cs="Arial"/>
-          <w:sz w:val="25"/>
-          <w:szCs w:val="25"/>
-        </w:rPr>
-      </w:pPr>
-      <w:r>
-        <w:rPr>
-          <w:rFonts w:ascii="Arial" w:eastAsia="Arial" w:hAnsi="Arial" w:cs="Arial"/>
-          <w:sz w:val="25"/>
-          <w:szCs w:val="25"/>
+        </w:rPr>
+      </w:pPr>
+      <w:r>
+        <w:rPr>
+          <w:rFonts w:ascii="Arial" w:eastAsia="Arial" w:hAnsi="Arial" w:cs="Arial"/>
         </w:rPr>
         <w:t>How long should the reconnection window be before awarding the win?</w:t>
       </w:r>
@@ -4919,102 +4688,811 @@
         </w:numPr>
         <w:rPr>
           <w:rFonts w:ascii="Arial" w:eastAsia="Arial" w:hAnsi="Arial" w:cs="Arial"/>
-          <w:sz w:val="25"/>
-          <w:szCs w:val="25"/>
-        </w:rPr>
-      </w:pPr>
-      <w:r>
-        <w:rPr>
-          <w:rFonts w:ascii="Arial" w:eastAsia="Arial" w:hAnsi="Arial" w:cs="Arial"/>
-          <w:sz w:val="25"/>
-          <w:szCs w:val="25"/>
+        </w:rPr>
+      </w:pPr>
+      <w:r>
+        <w:rPr>
+          <w:rFonts w:ascii="Arial" w:eastAsia="Arial" w:hAnsi="Arial" w:cs="Arial"/>
         </w:rPr>
         <w:t>How should the leaderboard handle cases where players repeatedly quit?</w:t>
       </w:r>
     </w:p>
     <w:p>
       <w:pPr>
-        <w:pStyle w:val="Body"/>
-        <w:rPr>
-          <w:rFonts w:ascii="Arial" w:eastAsia="Arial" w:hAnsi="Arial" w:cs="Arial"/>
-          <w:sz w:val="25"/>
-          <w:szCs w:val="25"/>
-        </w:rPr>
-      </w:pPr>
-    </w:p>
-    <w:p>
-      <w:pPr>
-        <w:pStyle w:val="Body"/>
-        <w:rPr>
-          <w:rFonts w:ascii="Arial" w:eastAsia="Arial" w:hAnsi="Arial" w:cs="Arial"/>
-          <w:sz w:val="25"/>
-          <w:szCs w:val="25"/>
-        </w:rPr>
-      </w:pPr>
-    </w:p>
-    <w:p>
-      <w:pPr>
-        <w:pStyle w:val="Body"/>
-      </w:pPr>
-    </w:p>
-    <w:p>
-      <w:pPr>
-        <w:pStyle w:val="Body"/>
-        <w:rPr>
-          <w:rFonts w:ascii="Arial" w:eastAsia="Arial" w:hAnsi="Arial" w:cs="Arial"/>
-          <w:sz w:val="25"/>
-          <w:szCs w:val="25"/>
-        </w:rPr>
-      </w:pPr>
-    </w:p>
-    <w:p>
-      <w:pPr>
-        <w:pStyle w:val="Body"/>
-        <w:rPr>
-          <w:rFonts w:ascii="Arial" w:eastAsia="Arial" w:hAnsi="Arial" w:cs="Arial"/>
-          <w:sz w:val="25"/>
-          <w:szCs w:val="25"/>
-        </w:rPr>
-      </w:pPr>
-    </w:p>
-    <w:p>
-      <w:pPr>
-        <w:pStyle w:val="Body"/>
-        <w:rPr>
-          <w:rFonts w:ascii="Arial" w:eastAsia="Arial" w:hAnsi="Arial" w:cs="Arial"/>
-          <w:sz w:val="25"/>
-          <w:szCs w:val="25"/>
-        </w:rPr>
-      </w:pPr>
-    </w:p>
-    <w:p>
-      <w:pPr>
-        <w:pStyle w:val="Body"/>
-      </w:pPr>
-    </w:p>
-    <w:p>
-      <w:pPr>
-        <w:pStyle w:val="Body"/>
-        <w:rPr>
-          <w:rFonts w:ascii="Arial" w:eastAsia="Arial" w:hAnsi="Arial" w:cs="Arial"/>
-          <w:sz w:val="25"/>
-          <w:szCs w:val="25"/>
-        </w:rPr>
-      </w:pPr>
-    </w:p>
-    <w:p>
-      <w:pPr>
-        <w:pStyle w:val="Body"/>
-        <w:rPr>
-          <w:rFonts w:ascii="Arial" w:eastAsia="Arial" w:hAnsi="Arial" w:cs="Arial"/>
-          <w:sz w:val="25"/>
-          <w:szCs w:val="25"/>
-        </w:rPr>
-      </w:pPr>
-    </w:p>
-    <w:p>
-      <w:pPr>
-        <w:pStyle w:val="Body"/>
+        <w:rPr>
+          <w:rFonts w:ascii="Arial" w:eastAsia="Arial" w:hAnsi="Arial" w:cs="Arial"/>
+          <w:color w:val="000000"/>
+          <w:kern w:val="2"/>
+          <w:u w:color="000000"/>
+          <w14:textOutline w14:w="0" w14:cap="flat" w14:cmpd="sng" w14:algn="ctr">
+            <w14:noFill/>
+            <w14:prstDash w14:val="solid"/>
+            <w14:bevel/>
+          </w14:textOutline>
+        </w:rPr>
+      </w:pPr>
+      <w:r>
+        <w:rPr>
+          <w:rFonts w:ascii="Arial" w:eastAsia="Arial" w:hAnsi="Arial" w:cs="Arial"/>
+        </w:rPr>
+        <w:br w:type="page"/>
+      </w:r>
+    </w:p>
+    <w:p>
+      <w:pPr>
+        <w:pStyle w:val="Body"/>
+        <w:rPr>
+          <w:rFonts w:ascii="Arial" w:eastAsia="Arial" w:hAnsi="Arial" w:cs="Arial"/>
+        </w:rPr>
+      </w:pPr>
+      <w:r>
+        <w:rPr>
+          <w:rFonts w:ascii="Arial" w:eastAsia="Arial" w:hAnsi="Arial" w:cs="Arial"/>
+        </w:rPr>
+        <w:lastRenderedPageBreak/>
+        <w:t>Use case: Send game result to server</w:t>
+      </w:r>
+    </w:p>
+    <w:p>
+      <w:pPr>
+        <w:pStyle w:val="Body"/>
+        <w:rPr>
+          <w:rFonts w:ascii="Arial" w:eastAsia="Arial" w:hAnsi="Arial" w:cs="Arial"/>
+        </w:rPr>
+      </w:pPr>
+      <w:r>
+        <w:rPr>
+          <w:rFonts w:ascii="Arial" w:eastAsia="Arial" w:hAnsi="Arial" w:cs="Arial"/>
+        </w:rPr>
+        <w:t>Iteration: 1</w:t>
+      </w:r>
+    </w:p>
+    <w:p>
+      <w:pPr>
+        <w:pStyle w:val="Body"/>
+        <w:rPr>
+          <w:rFonts w:ascii="Arial" w:eastAsia="Arial" w:hAnsi="Arial" w:cs="Arial"/>
+        </w:rPr>
+      </w:pPr>
+      <w:r>
+        <w:rPr>
+          <w:rFonts w:ascii="Arial" w:eastAsia="Arial" w:hAnsi="Arial" w:cs="Arial"/>
+        </w:rPr>
+        <w:t>Primary Actor: Server</w:t>
+      </w:r>
+    </w:p>
+    <w:p>
+      <w:pPr>
+        <w:pStyle w:val="Body"/>
+        <w:rPr>
+          <w:rFonts w:ascii="Arial" w:eastAsia="Arial" w:hAnsi="Arial" w:cs="Arial"/>
+        </w:rPr>
+      </w:pPr>
+    </w:p>
+    <w:p>
+      <w:pPr>
+        <w:pStyle w:val="Body"/>
+        <w:rPr>
+          <w:rFonts w:ascii="Arial" w:eastAsia="Arial" w:hAnsi="Arial" w:cs="Arial"/>
+        </w:rPr>
+      </w:pPr>
+      <w:r>
+        <w:rPr>
+          <w:rFonts w:ascii="Arial" w:eastAsia="Arial" w:hAnsi="Arial" w:cs="Arial"/>
+        </w:rPr>
+        <w:t>Goal in context: To ensure that the final game results are sent and stored on the server for leaderboard updates and game history tracking, accounting for cases where a player disconnected before the match ended.</w:t>
+      </w:r>
+    </w:p>
+    <w:p>
+      <w:pPr>
+        <w:pStyle w:val="Body"/>
+        <w:rPr>
+          <w:rFonts w:ascii="Arial" w:eastAsia="Arial" w:hAnsi="Arial" w:cs="Arial"/>
+        </w:rPr>
+      </w:pPr>
+    </w:p>
+    <w:p>
+      <w:pPr>
+        <w:pStyle w:val="Body"/>
+        <w:rPr>
+          <w:rFonts w:ascii="Arial" w:eastAsia="Arial" w:hAnsi="Arial" w:cs="Arial"/>
+        </w:rPr>
+      </w:pPr>
+      <w:r>
+        <w:rPr>
+          <w:rFonts w:ascii="Arial" w:eastAsia="Arial" w:hAnsi="Arial" w:cs="Arial"/>
+        </w:rPr>
+        <w:t>Preconditions:</w:t>
+      </w:r>
+    </w:p>
+    <w:p>
+      <w:pPr>
+        <w:pStyle w:val="Body"/>
+        <w:numPr>
+          <w:ilvl w:val="0"/>
+          <w:numId w:val="20"/>
+        </w:numPr>
+        <w:rPr>
+          <w:rFonts w:ascii="Arial" w:eastAsia="Arial" w:hAnsi="Arial" w:cs="Arial"/>
+        </w:rPr>
+      </w:pPr>
+      <w:r>
+        <w:rPr>
+          <w:rFonts w:ascii="Arial" w:eastAsia="Arial" w:hAnsi="Arial" w:cs="Arial"/>
+        </w:rPr>
+        <w:t>The game session has ended (win/loss/quit).</w:t>
+      </w:r>
+    </w:p>
+    <w:p>
+      <w:pPr>
+        <w:pStyle w:val="Body"/>
+        <w:numPr>
+          <w:ilvl w:val="0"/>
+          <w:numId w:val="20"/>
+        </w:numPr>
+        <w:rPr>
+          <w:rFonts w:ascii="Arial" w:eastAsia="Arial" w:hAnsi="Arial" w:cs="Arial"/>
+        </w:rPr>
+      </w:pPr>
+      <w:r>
+        <w:rPr>
+          <w:rFonts w:ascii="Arial" w:eastAsia="Arial" w:hAnsi="Arial" w:cs="Arial"/>
+        </w:rPr>
+        <w:t>The server is available to receive game results.</w:t>
+      </w:r>
+    </w:p>
+    <w:p>
+      <w:pPr>
+        <w:pStyle w:val="Body"/>
+        <w:numPr>
+          <w:ilvl w:val="0"/>
+          <w:numId w:val="20"/>
+        </w:numPr>
+        <w:rPr>
+          <w:rFonts w:ascii="Arial" w:eastAsia="Arial" w:hAnsi="Arial" w:cs="Arial"/>
+        </w:rPr>
+      </w:pPr>
+      <w:r>
+        <w:rPr>
+          <w:rFonts w:ascii="Arial" w:eastAsia="Arial" w:hAnsi="Arial" w:cs="Arial"/>
+        </w:rPr>
+        <w:t>The player is still connected to the network or has reconnected in time.</w:t>
+      </w:r>
+    </w:p>
+    <w:p>
+      <w:pPr>
+        <w:pStyle w:val="Body"/>
+        <w:numPr>
+          <w:ilvl w:val="0"/>
+          <w:numId w:val="20"/>
+        </w:numPr>
+        <w:rPr>
+          <w:rFonts w:ascii="Arial" w:eastAsia="Arial" w:hAnsi="Arial" w:cs="Arial"/>
+        </w:rPr>
+      </w:pPr>
+      <w:r>
+        <w:rPr>
+          <w:rFonts w:ascii="Arial" w:eastAsia="Arial" w:hAnsi="Arial" w:cs="Arial"/>
+        </w:rPr>
+        <w:t>Trigger: The game reaches an end-state and results need to be recorded.</w:t>
+      </w:r>
+    </w:p>
+    <w:p>
+      <w:pPr>
+        <w:pStyle w:val="Body"/>
+        <w:rPr>
+          <w:rFonts w:ascii="Arial" w:eastAsia="Arial" w:hAnsi="Arial" w:cs="Arial"/>
+        </w:rPr>
+      </w:pPr>
+    </w:p>
+    <w:p>
+      <w:pPr>
+        <w:pStyle w:val="Body"/>
+        <w:rPr>
+          <w:rFonts w:ascii="Arial" w:eastAsia="Arial" w:hAnsi="Arial" w:cs="Arial"/>
+        </w:rPr>
+      </w:pPr>
+      <w:r>
+        <w:rPr>
+          <w:rFonts w:ascii="Arial" w:eastAsia="Arial" w:hAnsi="Arial" w:cs="Arial"/>
+        </w:rPr>
+        <w:t>Scenario:</w:t>
+      </w:r>
+    </w:p>
+    <w:p>
+      <w:pPr>
+        <w:pStyle w:val="Body"/>
+        <w:numPr>
+          <w:ilvl w:val="0"/>
+          <w:numId w:val="21"/>
+        </w:numPr>
+        <w:rPr>
+          <w:rFonts w:ascii="Arial" w:eastAsia="Arial" w:hAnsi="Arial" w:cs="Arial"/>
+        </w:rPr>
+      </w:pPr>
+      <w:r>
+        <w:rPr>
+          <w:rFonts w:ascii="Arial" w:eastAsia="Arial" w:hAnsi="Arial" w:cs="Arial"/>
+        </w:rPr>
+        <w:t xml:space="preserve">The game session concludes with a winner, loser, or </w:t>
+      </w:r>
+      <w:proofErr w:type="gramStart"/>
+      <w:r>
+        <w:rPr>
+          <w:rFonts w:ascii="Arial" w:eastAsia="Arial" w:hAnsi="Arial" w:cs="Arial"/>
+        </w:rPr>
+        <w:t>quit</w:t>
+      </w:r>
+      <w:proofErr w:type="gramEnd"/>
+      <w:r>
+        <w:rPr>
+          <w:rFonts w:ascii="Arial" w:eastAsia="Arial" w:hAnsi="Arial" w:cs="Arial"/>
+        </w:rPr>
+        <w:t xml:space="preserve"> action.</w:t>
+      </w:r>
+    </w:p>
+    <w:p>
+      <w:pPr>
+        <w:pStyle w:val="Body"/>
+        <w:numPr>
+          <w:ilvl w:val="0"/>
+          <w:numId w:val="21"/>
+        </w:numPr>
+        <w:rPr>
+          <w:rFonts w:ascii="Arial" w:eastAsia="Arial" w:hAnsi="Arial" w:cs="Arial"/>
+        </w:rPr>
+      </w:pPr>
+      <w:r>
+        <w:rPr>
+          <w:rFonts w:ascii="Arial" w:eastAsia="Arial" w:hAnsi="Arial" w:cs="Arial"/>
+        </w:rPr>
+        <w:t>If a player disconnected, the system first checks whether they reconnected within the allowed time.</w:t>
+      </w:r>
+    </w:p>
+    <w:p>
+      <w:pPr>
+        <w:pStyle w:val="Body"/>
+        <w:numPr>
+          <w:ilvl w:val="0"/>
+          <w:numId w:val="21"/>
+        </w:numPr>
+        <w:rPr>
+          <w:rFonts w:ascii="Arial" w:eastAsia="Arial" w:hAnsi="Arial" w:cs="Arial"/>
+        </w:rPr>
+      </w:pPr>
+      <w:r>
+        <w:rPr>
+          <w:rFonts w:ascii="Arial" w:eastAsia="Arial" w:hAnsi="Arial" w:cs="Arial"/>
+        </w:rPr>
+        <w:t xml:space="preserve">If the disconnected player </w:t>
+      </w:r>
+      <w:proofErr w:type="gramStart"/>
+      <w:r>
+        <w:rPr>
+          <w:rFonts w:ascii="Arial" w:eastAsia="Arial" w:hAnsi="Arial" w:cs="Arial"/>
+        </w:rPr>
+        <w:t>did</w:t>
+      </w:r>
+      <w:proofErr w:type="gramEnd"/>
+      <w:r>
+        <w:rPr>
+          <w:rFonts w:ascii="Arial" w:eastAsia="Arial" w:hAnsi="Arial" w:cs="Arial"/>
+        </w:rPr>
+        <w:t xml:space="preserve"> not reconnect, the remaining player is declared the winner.</w:t>
+      </w:r>
+    </w:p>
+    <w:p>
+      <w:pPr>
+        <w:pStyle w:val="Body"/>
+        <w:numPr>
+          <w:ilvl w:val="0"/>
+          <w:numId w:val="21"/>
+        </w:numPr>
+        <w:rPr>
+          <w:rFonts w:ascii="Arial" w:eastAsia="Arial" w:hAnsi="Arial" w:cs="Arial"/>
+        </w:rPr>
+      </w:pPr>
+      <w:r>
+        <w:rPr>
+          <w:rFonts w:ascii="Arial" w:eastAsia="Arial" w:hAnsi="Arial" w:cs="Arial"/>
+        </w:rPr>
+        <w:t>The system compiles match details (players involved, final scores, time played, disconnection details, etc.).</w:t>
+      </w:r>
+    </w:p>
+    <w:p>
+      <w:pPr>
+        <w:pStyle w:val="Body"/>
+        <w:numPr>
+          <w:ilvl w:val="0"/>
+          <w:numId w:val="21"/>
+        </w:numPr>
+        <w:rPr>
+          <w:rFonts w:ascii="Arial" w:eastAsia="Arial" w:hAnsi="Arial" w:cs="Arial"/>
+        </w:rPr>
+      </w:pPr>
+      <w:r>
+        <w:rPr>
+          <w:rFonts w:ascii="Arial" w:eastAsia="Arial" w:hAnsi="Arial" w:cs="Arial"/>
+        </w:rPr>
+        <w:t>The compiled data is formatted and sent to the game server.</w:t>
+      </w:r>
+    </w:p>
+    <w:p>
+      <w:pPr>
+        <w:pStyle w:val="Body"/>
+        <w:numPr>
+          <w:ilvl w:val="0"/>
+          <w:numId w:val="21"/>
+        </w:numPr>
+        <w:rPr>
+          <w:rFonts w:ascii="Arial" w:eastAsia="Arial" w:hAnsi="Arial" w:cs="Arial"/>
+        </w:rPr>
+      </w:pPr>
+      <w:r>
+        <w:rPr>
+          <w:rFonts w:ascii="Arial" w:eastAsia="Arial" w:hAnsi="Arial" w:cs="Arial"/>
+        </w:rPr>
+        <w:t>The server receives the game result and stores it in the database.</w:t>
+      </w:r>
+    </w:p>
+    <w:p>
+      <w:pPr>
+        <w:pStyle w:val="Body"/>
+        <w:numPr>
+          <w:ilvl w:val="0"/>
+          <w:numId w:val="21"/>
+        </w:numPr>
+        <w:rPr>
+          <w:rFonts w:ascii="Arial" w:eastAsia="Arial" w:hAnsi="Arial" w:cs="Arial"/>
+        </w:rPr>
+      </w:pPr>
+      <w:r>
+        <w:rPr>
+          <w:rFonts w:ascii="Arial" w:eastAsia="Arial" w:hAnsi="Arial" w:cs="Arial"/>
+        </w:rPr>
+        <w:t>The server updates player statistics, rankings, and leaderboards.</w:t>
+      </w:r>
+    </w:p>
+    <w:p>
+      <w:pPr>
+        <w:pStyle w:val="Body"/>
+        <w:numPr>
+          <w:ilvl w:val="0"/>
+          <w:numId w:val="21"/>
+        </w:numPr>
+        <w:rPr>
+          <w:rFonts w:ascii="Arial" w:eastAsia="Arial" w:hAnsi="Arial" w:cs="Arial"/>
+        </w:rPr>
+      </w:pPr>
+      <w:r>
+        <w:rPr>
+          <w:rFonts w:ascii="Arial" w:eastAsia="Arial" w:hAnsi="Arial" w:cs="Arial"/>
+        </w:rPr>
+        <w:t>The updated information is made available for player profiles and public leaderboards.</w:t>
+      </w:r>
+    </w:p>
+    <w:p>
+      <w:pPr>
+        <w:pStyle w:val="Body"/>
+        <w:ind w:left="720"/>
+        <w:rPr>
+          <w:rFonts w:ascii="Arial" w:eastAsia="Arial" w:hAnsi="Arial" w:cs="Arial"/>
+        </w:rPr>
+      </w:pPr>
+    </w:p>
+    <w:p>
+      <w:pPr>
+        <w:pStyle w:val="Body"/>
+        <w:rPr>
+          <w:rFonts w:ascii="Arial" w:eastAsia="Arial" w:hAnsi="Arial" w:cs="Arial"/>
+        </w:rPr>
+      </w:pPr>
+      <w:r>
+        <w:rPr>
+          <w:rFonts w:ascii="Arial" w:eastAsia="Arial" w:hAnsi="Arial" w:cs="Arial"/>
+        </w:rPr>
+        <w:t>Post conditions:</w:t>
+      </w:r>
+    </w:p>
+    <w:p>
+      <w:pPr>
+        <w:pStyle w:val="Body"/>
+        <w:numPr>
+          <w:ilvl w:val="0"/>
+          <w:numId w:val="22"/>
+        </w:numPr>
+        <w:rPr>
+          <w:rFonts w:ascii="Arial" w:eastAsia="Arial" w:hAnsi="Arial" w:cs="Arial"/>
+        </w:rPr>
+      </w:pPr>
+      <w:r>
+        <w:rPr>
+          <w:rFonts w:ascii="Arial" w:eastAsia="Arial" w:hAnsi="Arial" w:cs="Arial"/>
+        </w:rPr>
+        <w:t>The game results are successfully stored in the database.</w:t>
+      </w:r>
+    </w:p>
+    <w:p>
+      <w:pPr>
+        <w:pStyle w:val="Body"/>
+        <w:numPr>
+          <w:ilvl w:val="0"/>
+          <w:numId w:val="22"/>
+        </w:numPr>
+        <w:rPr>
+          <w:rFonts w:ascii="Arial" w:eastAsia="Arial" w:hAnsi="Arial" w:cs="Arial"/>
+        </w:rPr>
+      </w:pPr>
+      <w:r>
+        <w:rPr>
+          <w:rFonts w:ascii="Arial" w:eastAsia="Arial" w:hAnsi="Arial" w:cs="Arial"/>
+        </w:rPr>
+        <w:t>Player statistics are updated, including tracking disconnections if applicable.</w:t>
+      </w:r>
+    </w:p>
+    <w:p>
+      <w:pPr>
+        <w:pStyle w:val="Body"/>
+        <w:numPr>
+          <w:ilvl w:val="0"/>
+          <w:numId w:val="22"/>
+        </w:numPr>
+        <w:rPr>
+          <w:rFonts w:ascii="Arial" w:eastAsia="Arial" w:hAnsi="Arial" w:cs="Arial"/>
+        </w:rPr>
+      </w:pPr>
+      <w:r>
+        <w:rPr>
+          <w:rFonts w:ascii="Arial" w:eastAsia="Arial" w:hAnsi="Arial" w:cs="Arial"/>
+        </w:rPr>
+        <w:t>The leaderboard is refreshed with the latest rankings.</w:t>
+      </w:r>
+    </w:p>
+    <w:p>
+      <w:pPr>
+        <w:pStyle w:val="Body"/>
+        <w:rPr>
+          <w:rFonts w:ascii="Arial" w:eastAsia="Arial" w:hAnsi="Arial" w:cs="Arial"/>
+        </w:rPr>
+      </w:pPr>
+      <w:r>
+        <w:rPr>
+          <w:rFonts w:ascii="Arial" w:eastAsia="Arial" w:hAnsi="Arial" w:cs="Arial"/>
+        </w:rPr>
+        <w:t>Exceptions:</w:t>
+      </w:r>
+    </w:p>
+    <w:p>
+      <w:pPr>
+        <w:pStyle w:val="Body"/>
+        <w:numPr>
+          <w:ilvl w:val="0"/>
+          <w:numId w:val="23"/>
+        </w:numPr>
+        <w:rPr>
+          <w:rFonts w:ascii="Arial" w:eastAsia="Arial" w:hAnsi="Arial" w:cs="Arial"/>
+        </w:rPr>
+      </w:pPr>
+      <w:r>
+        <w:rPr>
+          <w:rFonts w:ascii="Arial" w:eastAsia="Arial" w:hAnsi="Arial" w:cs="Arial"/>
+        </w:rPr>
+        <w:t>Network failure prevents the result from being sent.</w:t>
+      </w:r>
+    </w:p>
+    <w:p>
+      <w:pPr>
+        <w:pStyle w:val="Body"/>
+        <w:numPr>
+          <w:ilvl w:val="0"/>
+          <w:numId w:val="23"/>
+        </w:numPr>
+        <w:rPr>
+          <w:rFonts w:ascii="Arial" w:eastAsia="Arial" w:hAnsi="Arial" w:cs="Arial"/>
+        </w:rPr>
+      </w:pPr>
+      <w:r>
+        <w:rPr>
+          <w:rFonts w:ascii="Arial" w:eastAsia="Arial" w:hAnsi="Arial" w:cs="Arial"/>
+        </w:rPr>
+        <w:t>The server is down or does not respond.</w:t>
+      </w:r>
+    </w:p>
+    <w:p>
+      <w:pPr>
+        <w:pStyle w:val="Body"/>
+        <w:numPr>
+          <w:ilvl w:val="0"/>
+          <w:numId w:val="23"/>
+        </w:numPr>
+        <w:rPr>
+          <w:rFonts w:ascii="Arial" w:eastAsia="Arial" w:hAnsi="Arial" w:cs="Arial"/>
+        </w:rPr>
+      </w:pPr>
+      <w:r>
+        <w:rPr>
+          <w:rFonts w:ascii="Arial" w:eastAsia="Arial" w:hAnsi="Arial" w:cs="Arial"/>
+        </w:rPr>
+        <w:t>Data corruption occurs while transmitting match results.</w:t>
+      </w:r>
+    </w:p>
+    <w:p>
+      <w:pPr>
+        <w:pStyle w:val="Body"/>
+        <w:ind w:left="360"/>
+        <w:rPr>
+          <w:rFonts w:ascii="Arial" w:eastAsia="Arial" w:hAnsi="Arial" w:cs="Arial"/>
+        </w:rPr>
+      </w:pPr>
+      <w:r>
+        <w:rPr>
+          <w:rFonts w:ascii="Arial" w:eastAsia="Arial" w:hAnsi="Arial" w:cs="Arial"/>
+        </w:rPr>
+        <w:t>.</w:t>
+      </w:r>
+    </w:p>
+    <w:p>
+      <w:pPr>
+        <w:pStyle w:val="Body"/>
+        <w:rPr>
+          <w:rFonts w:ascii="Arial" w:eastAsia="Arial" w:hAnsi="Arial" w:cs="Arial"/>
+        </w:rPr>
+      </w:pPr>
+      <w:r>
+        <w:rPr>
+          <w:rFonts w:ascii="Arial" w:eastAsia="Arial" w:hAnsi="Arial" w:cs="Arial"/>
+        </w:rPr>
+        <w:t>Priority: High (Accurate game tracking is essential for leaderboard and player experience).</w:t>
+      </w:r>
+    </w:p>
+    <w:p>
+      <w:pPr>
+        <w:pStyle w:val="Body"/>
+        <w:rPr>
+          <w:rFonts w:ascii="Arial" w:eastAsia="Arial" w:hAnsi="Arial" w:cs="Arial"/>
+        </w:rPr>
+      </w:pPr>
+    </w:p>
+    <w:p>
+      <w:pPr>
+        <w:pStyle w:val="Body"/>
+        <w:rPr>
+          <w:rFonts w:ascii="Arial" w:eastAsia="Arial" w:hAnsi="Arial" w:cs="Arial"/>
+        </w:rPr>
+      </w:pPr>
+      <w:r>
+        <w:rPr>
+          <w:rFonts w:ascii="Arial" w:eastAsia="Arial" w:hAnsi="Arial" w:cs="Arial"/>
+        </w:rPr>
+        <w:t>When available: 3rd iteration</w:t>
+      </w:r>
+    </w:p>
+    <w:p>
+      <w:pPr>
+        <w:pStyle w:val="Body"/>
+        <w:rPr>
+          <w:rFonts w:ascii="Arial" w:eastAsia="Arial" w:hAnsi="Arial" w:cs="Arial"/>
+        </w:rPr>
+      </w:pPr>
+    </w:p>
+    <w:p>
+      <w:pPr>
+        <w:pStyle w:val="Body"/>
+        <w:rPr>
+          <w:rFonts w:ascii="Arial" w:eastAsia="Arial" w:hAnsi="Arial" w:cs="Arial"/>
+        </w:rPr>
+      </w:pPr>
+      <w:r>
+        <w:rPr>
+          <w:rFonts w:ascii="Arial" w:eastAsia="Arial" w:hAnsi="Arial" w:cs="Arial"/>
+        </w:rPr>
+        <w:t>Frequency of use: High (Occurs at the end of every game session).</w:t>
+      </w:r>
+    </w:p>
+    <w:p>
+      <w:pPr>
+        <w:pStyle w:val="Body"/>
+        <w:rPr>
+          <w:rFonts w:ascii="Arial" w:eastAsia="Arial" w:hAnsi="Arial" w:cs="Arial"/>
+        </w:rPr>
+      </w:pPr>
+    </w:p>
+    <w:p>
+      <w:pPr>
+        <w:pStyle w:val="Body"/>
+        <w:rPr>
+          <w:rFonts w:ascii="Arial" w:eastAsia="Arial" w:hAnsi="Arial" w:cs="Arial"/>
+        </w:rPr>
+      </w:pPr>
+      <w:r>
+        <w:rPr>
+          <w:rFonts w:ascii="Arial" w:eastAsia="Arial" w:hAnsi="Arial" w:cs="Arial"/>
+        </w:rPr>
+        <w:t>Channel to actor: Server API, network connection</w:t>
+      </w:r>
+    </w:p>
+    <w:p>
+      <w:pPr>
+        <w:pStyle w:val="Body"/>
+        <w:rPr>
+          <w:rFonts w:ascii="Arial" w:eastAsia="Arial" w:hAnsi="Arial" w:cs="Arial"/>
+        </w:rPr>
+      </w:pPr>
+    </w:p>
+    <w:p>
+      <w:pPr>
+        <w:pStyle w:val="Body"/>
+        <w:rPr>
+          <w:rFonts w:ascii="Arial" w:eastAsia="Arial" w:hAnsi="Arial" w:cs="Arial"/>
+        </w:rPr>
+      </w:pPr>
+      <w:r>
+        <w:rPr>
+          <w:rFonts w:ascii="Arial" w:eastAsia="Arial" w:hAnsi="Arial" w:cs="Arial"/>
+        </w:rPr>
+        <w:lastRenderedPageBreak/>
+        <w:t>Secondary actors: Game server, leaderboard system</w:t>
+      </w:r>
+    </w:p>
+    <w:p>
+      <w:pPr>
+        <w:pStyle w:val="Body"/>
+        <w:rPr>
+          <w:rFonts w:ascii="Arial" w:eastAsia="Arial" w:hAnsi="Arial" w:cs="Arial"/>
+        </w:rPr>
+      </w:pPr>
+    </w:p>
+    <w:p>
+      <w:pPr>
+        <w:pStyle w:val="Body"/>
+        <w:rPr>
+          <w:rFonts w:ascii="Arial" w:eastAsia="Arial" w:hAnsi="Arial" w:cs="Arial"/>
+        </w:rPr>
+      </w:pPr>
+      <w:r>
+        <w:rPr>
+          <w:rFonts w:ascii="Arial" w:eastAsia="Arial" w:hAnsi="Arial" w:cs="Arial"/>
+        </w:rPr>
+        <w:t>Channel to secondary actors: Internet connection</w:t>
+      </w:r>
+    </w:p>
+    <w:p>
+      <w:pPr>
+        <w:pStyle w:val="Body"/>
+        <w:rPr>
+          <w:rFonts w:ascii="Arial" w:eastAsia="Arial" w:hAnsi="Arial" w:cs="Arial"/>
+        </w:rPr>
+      </w:pPr>
+    </w:p>
+    <w:p>
+      <w:pPr>
+        <w:pStyle w:val="Body"/>
+        <w:rPr>
+          <w:rFonts w:ascii="Arial" w:eastAsia="Arial" w:hAnsi="Arial" w:cs="Arial"/>
+        </w:rPr>
+      </w:pPr>
+      <w:r>
+        <w:rPr>
+          <w:rFonts w:ascii="Arial" w:eastAsia="Arial" w:hAnsi="Arial" w:cs="Arial"/>
+        </w:rPr>
+        <w:t>Open issues:</w:t>
+      </w:r>
+    </w:p>
+    <w:p>
+      <w:pPr>
+        <w:pStyle w:val="Body"/>
+        <w:numPr>
+          <w:ilvl w:val="0"/>
+          <w:numId w:val="24"/>
+        </w:numPr>
+        <w:rPr>
+          <w:rFonts w:ascii="Arial" w:eastAsia="Arial" w:hAnsi="Arial" w:cs="Arial"/>
+        </w:rPr>
+      </w:pPr>
+      <w:r>
+        <w:rPr>
+          <w:rFonts w:ascii="Arial" w:eastAsia="Arial" w:hAnsi="Arial" w:cs="Arial"/>
+        </w:rPr>
+        <w:t>Should repeated disconnections affect a player’s ranking or matchmaking score?</w:t>
+      </w:r>
+    </w:p>
+    <w:p>
+      <w:pPr>
+        <w:pStyle w:val="Body"/>
+        <w:numPr>
+          <w:ilvl w:val="0"/>
+          <w:numId w:val="24"/>
+        </w:numPr>
+        <w:rPr>
+          <w:rFonts w:ascii="Arial" w:eastAsia="Arial" w:hAnsi="Arial" w:cs="Arial"/>
+        </w:rPr>
+      </w:pPr>
+      <w:r>
+        <w:rPr>
+          <w:rFonts w:ascii="Arial" w:eastAsia="Arial" w:hAnsi="Arial" w:cs="Arial"/>
+        </w:rPr>
+        <w:t xml:space="preserve">How should the system handle </w:t>
+      </w:r>
+      <w:r>
+        <w:rPr>
+          <w:rFonts w:ascii="Arial" w:eastAsia="Arial" w:hAnsi="Arial" w:cs="Arial"/>
+        </w:rPr>
+        <w:t>intentional quitting?</w:t>
+      </w:r>
+    </w:p>
+    <w:p>
+      <w:pPr>
+        <w:pStyle w:val="Body"/>
+        <w:rPr>
+          <w:rFonts w:ascii="Arial" w:eastAsia="Arial" w:hAnsi="Arial" w:cs="Arial"/>
+        </w:rPr>
+      </w:pPr>
+    </w:p>
+    <w:p>
+      <w:pPr>
+        <w:pStyle w:val="Body"/>
+        <w:rPr>
+          <w:sz w:val="22"/>
+          <w:szCs w:val="22"/>
+        </w:rPr>
+      </w:pPr>
+    </w:p>
+    <w:p>
+      <w:pPr>
+        <w:pStyle w:val="Body"/>
+        <w:rPr>
+          <w:rFonts w:ascii="Arial" w:eastAsia="Arial" w:hAnsi="Arial" w:cs="Arial"/>
+        </w:rPr>
+      </w:pPr>
+    </w:p>
+    <w:p>
+      <w:pPr>
+        <w:pStyle w:val="Body"/>
+        <w:rPr>
+          <w:rFonts w:ascii="Arial" w:eastAsia="Arial" w:hAnsi="Arial" w:cs="Arial"/>
+        </w:rPr>
+      </w:pPr>
+    </w:p>
+    <w:p>
+      <w:pPr>
+        <w:pStyle w:val="Body"/>
+        <w:rPr>
+          <w:rFonts w:ascii="Arial" w:eastAsia="Arial" w:hAnsi="Arial" w:cs="Arial"/>
+        </w:rPr>
+      </w:pPr>
+    </w:p>
+    <w:p>
+      <w:pPr>
+        <w:pStyle w:val="Body"/>
+        <w:rPr>
+          <w:sz w:val="22"/>
+          <w:szCs w:val="22"/>
+        </w:rPr>
+      </w:pPr>
+    </w:p>
+    <w:p>
+      <w:pPr>
+        <w:pStyle w:val="Body"/>
+        <w:rPr>
+          <w:rFonts w:ascii="Arial" w:eastAsia="Arial" w:hAnsi="Arial" w:cs="Arial"/>
+        </w:rPr>
+      </w:pPr>
+    </w:p>
+    <w:p>
+      <w:pPr>
+        <w:pStyle w:val="Body"/>
+        <w:rPr>
+          <w:rFonts w:ascii="Arial" w:eastAsia="Arial" w:hAnsi="Arial" w:cs="Arial"/>
+        </w:rPr>
+      </w:pPr>
+    </w:p>
+    <w:p>
+      <w:pPr>
+        <w:pStyle w:val="Body"/>
+        <w:rPr>
+          <w:sz w:val="22"/>
+          <w:szCs w:val="22"/>
+        </w:rPr>
       </w:pPr>
     </w:p>
     <w:sectPr>
@@ -5245,6 +5723,92 @@
     <w:numStyleLink w:val="Numbered"/>
   </w:abstractNum>
   <w:abstractNum w:abstractNumId="3" w15:restartNumberingAfterBreak="0">
+    <w:nsid w:val="25E91F3E"/>
+    <w:multiLevelType w:val="hybridMultilevel"/>
+    <w:tmpl w:val="A9BC1714"/>
+    <w:lvl w:ilvl="0" w:tplc="0409000F">
+      <w:start w:val="1"/>
+      <w:numFmt w:val="decimal"/>
+      <w:lvlText w:val="%1."/>
+      <w:lvlJc w:val="left"/>
+      <w:pPr>
+        <w:ind w:left="720" w:hanging="360"/>
+      </w:pPr>
+    </w:lvl>
+    <w:lvl w:ilvl="1" w:tplc="04090019" w:tentative="1">
+      <w:start w:val="1"/>
+      <w:numFmt w:val="lowerLetter"/>
+      <w:lvlText w:val="%2."/>
+      <w:lvlJc w:val="left"/>
+      <w:pPr>
+        <w:ind w:left="1440" w:hanging="360"/>
+      </w:pPr>
+    </w:lvl>
+    <w:lvl w:ilvl="2" w:tplc="0409001B" w:tentative="1">
+      <w:start w:val="1"/>
+      <w:numFmt w:val="lowerRoman"/>
+      <w:lvlText w:val="%3."/>
+      <w:lvlJc w:val="right"/>
+      <w:pPr>
+        <w:ind w:left="2160" w:hanging="180"/>
+      </w:pPr>
+    </w:lvl>
+    <w:lvl w:ilvl="3" w:tplc="0409000F" w:tentative="1">
+      <w:start w:val="1"/>
+      <w:numFmt w:val="decimal"/>
+      <w:lvlText w:val="%4."/>
+      <w:lvlJc w:val="left"/>
+      <w:pPr>
+        <w:ind w:left="2880" w:hanging="360"/>
+      </w:pPr>
+    </w:lvl>
+    <w:lvl w:ilvl="4" w:tplc="04090019" w:tentative="1">
+      <w:start w:val="1"/>
+      <w:numFmt w:val="lowerLetter"/>
+      <w:lvlText w:val="%5."/>
+      <w:lvlJc w:val="left"/>
+      <w:pPr>
+        <w:ind w:left="3600" w:hanging="360"/>
+      </w:pPr>
+    </w:lvl>
+    <w:lvl w:ilvl="5" w:tplc="0409001B" w:tentative="1">
+      <w:start w:val="1"/>
+      <w:numFmt w:val="lowerRoman"/>
+      <w:lvlText w:val="%6."/>
+      <w:lvlJc w:val="right"/>
+      <w:pPr>
+        <w:ind w:left="4320" w:hanging="180"/>
+      </w:pPr>
+    </w:lvl>
+    <w:lvl w:ilvl="6" w:tplc="0409000F" w:tentative="1">
+      <w:start w:val="1"/>
+      <w:numFmt w:val="decimal"/>
+      <w:lvlText w:val="%7."/>
+      <w:lvlJc w:val="left"/>
+      <w:pPr>
+        <w:ind w:left="5040" w:hanging="360"/>
+      </w:pPr>
+    </w:lvl>
+    <w:lvl w:ilvl="7" w:tplc="04090019" w:tentative="1">
+      <w:start w:val="1"/>
+      <w:numFmt w:val="lowerLetter"/>
+      <w:lvlText w:val="%8."/>
+      <w:lvlJc w:val="left"/>
+      <w:pPr>
+        <w:ind w:left="5760" w:hanging="360"/>
+      </w:pPr>
+    </w:lvl>
+    <w:lvl w:ilvl="8" w:tplc="0409001B" w:tentative="1">
+      <w:start w:val="1"/>
+      <w:numFmt w:val="lowerRoman"/>
+      <w:lvlText w:val="%9."/>
+      <w:lvlJc w:val="right"/>
+      <w:pPr>
+        <w:ind w:left="6480" w:hanging="180"/>
+      </w:pPr>
+    </w:lvl>
+  </w:abstractNum>
+  <w:abstractNum w:abstractNumId="4" w15:restartNumberingAfterBreak="0">
     <w:nsid w:val="2B2B5C83"/>
     <w:multiLevelType w:val="hybridMultilevel"/>
     <w:tmpl w:val="C8B67548"/>
@@ -5511,7 +6075,7 @@
       </w:rPr>
     </w:lvl>
   </w:abstractNum>
-  <w:abstractNum w:abstractNumId="4" w15:restartNumberingAfterBreak="0">
+  <w:abstractNum w:abstractNumId="5" w15:restartNumberingAfterBreak="0">
     <w:nsid w:val="30126ADD"/>
     <w:multiLevelType w:val="hybridMultilevel"/>
     <w:tmpl w:val="EF6ED0AA"/>
@@ -5597,13 +6161,185 @@
       </w:pPr>
     </w:lvl>
   </w:abstractNum>
-  <w:abstractNum w:abstractNumId="5" w15:restartNumberingAfterBreak="0">
+  <w:abstractNum w:abstractNumId="6" w15:restartNumberingAfterBreak="0">
+    <w:nsid w:val="31EF5BFF"/>
+    <w:multiLevelType w:val="hybridMultilevel"/>
+    <w:tmpl w:val="FBDCECBA"/>
+    <w:lvl w:ilvl="0" w:tplc="0409000F">
+      <w:start w:val="1"/>
+      <w:numFmt w:val="decimal"/>
+      <w:lvlText w:val="%1."/>
+      <w:lvlJc w:val="left"/>
+      <w:pPr>
+        <w:ind w:left="720" w:hanging="360"/>
+      </w:pPr>
+    </w:lvl>
+    <w:lvl w:ilvl="1" w:tplc="04090019" w:tentative="1">
+      <w:start w:val="1"/>
+      <w:numFmt w:val="lowerLetter"/>
+      <w:lvlText w:val="%2."/>
+      <w:lvlJc w:val="left"/>
+      <w:pPr>
+        <w:ind w:left="1440" w:hanging="360"/>
+      </w:pPr>
+    </w:lvl>
+    <w:lvl w:ilvl="2" w:tplc="0409001B" w:tentative="1">
+      <w:start w:val="1"/>
+      <w:numFmt w:val="lowerRoman"/>
+      <w:lvlText w:val="%3."/>
+      <w:lvlJc w:val="right"/>
+      <w:pPr>
+        <w:ind w:left="2160" w:hanging="180"/>
+      </w:pPr>
+    </w:lvl>
+    <w:lvl w:ilvl="3" w:tplc="0409000F" w:tentative="1">
+      <w:start w:val="1"/>
+      <w:numFmt w:val="decimal"/>
+      <w:lvlText w:val="%4."/>
+      <w:lvlJc w:val="left"/>
+      <w:pPr>
+        <w:ind w:left="2880" w:hanging="360"/>
+      </w:pPr>
+    </w:lvl>
+    <w:lvl w:ilvl="4" w:tplc="04090019" w:tentative="1">
+      <w:start w:val="1"/>
+      <w:numFmt w:val="lowerLetter"/>
+      <w:lvlText w:val="%5."/>
+      <w:lvlJc w:val="left"/>
+      <w:pPr>
+        <w:ind w:left="3600" w:hanging="360"/>
+      </w:pPr>
+    </w:lvl>
+    <w:lvl w:ilvl="5" w:tplc="0409001B" w:tentative="1">
+      <w:start w:val="1"/>
+      <w:numFmt w:val="lowerRoman"/>
+      <w:lvlText w:val="%6."/>
+      <w:lvlJc w:val="right"/>
+      <w:pPr>
+        <w:ind w:left="4320" w:hanging="180"/>
+      </w:pPr>
+    </w:lvl>
+    <w:lvl w:ilvl="6" w:tplc="0409000F" w:tentative="1">
+      <w:start w:val="1"/>
+      <w:numFmt w:val="decimal"/>
+      <w:lvlText w:val="%7."/>
+      <w:lvlJc w:val="left"/>
+      <w:pPr>
+        <w:ind w:left="5040" w:hanging="360"/>
+      </w:pPr>
+    </w:lvl>
+    <w:lvl w:ilvl="7" w:tplc="04090019" w:tentative="1">
+      <w:start w:val="1"/>
+      <w:numFmt w:val="lowerLetter"/>
+      <w:lvlText w:val="%8."/>
+      <w:lvlJc w:val="left"/>
+      <w:pPr>
+        <w:ind w:left="5760" w:hanging="360"/>
+      </w:pPr>
+    </w:lvl>
+    <w:lvl w:ilvl="8" w:tplc="0409001B" w:tentative="1">
+      <w:start w:val="1"/>
+      <w:numFmt w:val="lowerRoman"/>
+      <w:lvlText w:val="%9."/>
+      <w:lvlJc w:val="right"/>
+      <w:pPr>
+        <w:ind w:left="6480" w:hanging="180"/>
+      </w:pPr>
+    </w:lvl>
+  </w:abstractNum>
+  <w:abstractNum w:abstractNumId="7" w15:restartNumberingAfterBreak="0">
+    <w:nsid w:val="32761BEA"/>
+    <w:multiLevelType w:val="hybridMultilevel"/>
+    <w:tmpl w:val="302EB81E"/>
+    <w:lvl w:ilvl="0" w:tplc="0409000F">
+      <w:start w:val="1"/>
+      <w:numFmt w:val="decimal"/>
+      <w:lvlText w:val="%1."/>
+      <w:lvlJc w:val="left"/>
+      <w:pPr>
+        <w:ind w:left="720" w:hanging="360"/>
+      </w:pPr>
+    </w:lvl>
+    <w:lvl w:ilvl="1" w:tplc="04090019" w:tentative="1">
+      <w:start w:val="1"/>
+      <w:numFmt w:val="lowerLetter"/>
+      <w:lvlText w:val="%2."/>
+      <w:lvlJc w:val="left"/>
+      <w:pPr>
+        <w:ind w:left="1440" w:hanging="360"/>
+      </w:pPr>
+    </w:lvl>
+    <w:lvl w:ilvl="2" w:tplc="0409001B" w:tentative="1">
+      <w:start w:val="1"/>
+      <w:numFmt w:val="lowerRoman"/>
+      <w:lvlText w:val="%3."/>
+      <w:lvlJc w:val="right"/>
+      <w:pPr>
+        <w:ind w:left="2160" w:hanging="180"/>
+      </w:pPr>
+    </w:lvl>
+    <w:lvl w:ilvl="3" w:tplc="0409000F" w:tentative="1">
+      <w:start w:val="1"/>
+      <w:numFmt w:val="decimal"/>
+      <w:lvlText w:val="%4."/>
+      <w:lvlJc w:val="left"/>
+      <w:pPr>
+        <w:ind w:left="2880" w:hanging="360"/>
+      </w:pPr>
+    </w:lvl>
+    <w:lvl w:ilvl="4" w:tplc="04090019" w:tentative="1">
+      <w:start w:val="1"/>
+      <w:numFmt w:val="lowerLetter"/>
+      <w:lvlText w:val="%5."/>
+      <w:lvlJc w:val="left"/>
+      <w:pPr>
+        <w:ind w:left="3600" w:hanging="360"/>
+      </w:pPr>
+    </w:lvl>
+    <w:lvl w:ilvl="5" w:tplc="0409001B" w:tentative="1">
+      <w:start w:val="1"/>
+      <w:numFmt w:val="lowerRoman"/>
+      <w:lvlText w:val="%6."/>
+      <w:lvlJc w:val="right"/>
+      <w:pPr>
+        <w:ind w:left="4320" w:hanging="180"/>
+      </w:pPr>
+    </w:lvl>
+    <w:lvl w:ilvl="6" w:tplc="0409000F" w:tentative="1">
+      <w:start w:val="1"/>
+      <w:numFmt w:val="decimal"/>
+      <w:lvlText w:val="%7."/>
+      <w:lvlJc w:val="left"/>
+      <w:pPr>
+        <w:ind w:left="5040" w:hanging="360"/>
+      </w:pPr>
+    </w:lvl>
+    <w:lvl w:ilvl="7" w:tplc="04090019" w:tentative="1">
+      <w:start w:val="1"/>
+      <w:numFmt w:val="lowerLetter"/>
+      <w:lvlText w:val="%8."/>
+      <w:lvlJc w:val="left"/>
+      <w:pPr>
+        <w:ind w:left="5760" w:hanging="360"/>
+      </w:pPr>
+    </w:lvl>
+    <w:lvl w:ilvl="8" w:tplc="0409001B" w:tentative="1">
+      <w:start w:val="1"/>
+      <w:numFmt w:val="lowerRoman"/>
+      <w:lvlText w:val="%9."/>
+      <w:lvlJc w:val="right"/>
+      <w:pPr>
+        <w:ind w:left="6480" w:hanging="180"/>
+      </w:pPr>
+    </w:lvl>
+  </w:abstractNum>
+  <w:abstractNum w:abstractNumId="8" w15:restartNumberingAfterBreak="0">
     <w:nsid w:val="45D55287"/>
     <w:multiLevelType w:val="hybridMultilevel"/>
     <w:tmpl w:val="16BEE4AC"/>
     <w:numStyleLink w:val="Numbered0"/>
   </w:abstractNum>
-  <w:abstractNum w:abstractNumId="6" w15:restartNumberingAfterBreak="0">
+  <w:abstractNum w:abstractNumId="9" w15:restartNumberingAfterBreak="0">
     <w:nsid w:val="475A115E"/>
     <w:multiLevelType w:val="hybridMultilevel"/>
     <w:tmpl w:val="DC9AA9D4"/>
@@ -5689,7 +6425,7 @@
       </w:pPr>
     </w:lvl>
   </w:abstractNum>
-  <w:abstractNum w:abstractNumId="7" w15:restartNumberingAfterBreak="0">
+  <w:abstractNum w:abstractNumId="10" w15:restartNumberingAfterBreak="0">
     <w:nsid w:val="498B1EF3"/>
     <w:multiLevelType w:val="hybridMultilevel"/>
     <w:tmpl w:val="9C20FBC6"/>
@@ -5775,7 +6511,7 @@
       </w:pPr>
     </w:lvl>
   </w:abstractNum>
-  <w:abstractNum w:abstractNumId="8" w15:restartNumberingAfterBreak="0">
+  <w:abstractNum w:abstractNumId="11" w15:restartNumberingAfterBreak="0">
     <w:nsid w:val="51904F74"/>
     <w:multiLevelType w:val="hybridMultilevel"/>
     <w:tmpl w:val="C55CCDC8"/>
@@ -5861,7 +6597,179 @@
       </w:pPr>
     </w:lvl>
   </w:abstractNum>
-  <w:abstractNum w:abstractNumId="9" w15:restartNumberingAfterBreak="0">
+  <w:abstractNum w:abstractNumId="12" w15:restartNumberingAfterBreak="0">
+    <w:nsid w:val="5CCF3195"/>
+    <w:multiLevelType w:val="hybridMultilevel"/>
+    <w:tmpl w:val="DDA80BCA"/>
+    <w:lvl w:ilvl="0" w:tplc="0409000F">
+      <w:start w:val="1"/>
+      <w:numFmt w:val="decimal"/>
+      <w:lvlText w:val="%1."/>
+      <w:lvlJc w:val="left"/>
+      <w:pPr>
+        <w:ind w:left="720" w:hanging="360"/>
+      </w:pPr>
+    </w:lvl>
+    <w:lvl w:ilvl="1" w:tplc="04090019" w:tentative="1">
+      <w:start w:val="1"/>
+      <w:numFmt w:val="lowerLetter"/>
+      <w:lvlText w:val="%2."/>
+      <w:lvlJc w:val="left"/>
+      <w:pPr>
+        <w:ind w:left="1440" w:hanging="360"/>
+      </w:pPr>
+    </w:lvl>
+    <w:lvl w:ilvl="2" w:tplc="0409001B" w:tentative="1">
+      <w:start w:val="1"/>
+      <w:numFmt w:val="lowerRoman"/>
+      <w:lvlText w:val="%3."/>
+      <w:lvlJc w:val="right"/>
+      <w:pPr>
+        <w:ind w:left="2160" w:hanging="180"/>
+      </w:pPr>
+    </w:lvl>
+    <w:lvl w:ilvl="3" w:tplc="0409000F" w:tentative="1">
+      <w:start w:val="1"/>
+      <w:numFmt w:val="decimal"/>
+      <w:lvlText w:val="%4."/>
+      <w:lvlJc w:val="left"/>
+      <w:pPr>
+        <w:ind w:left="2880" w:hanging="360"/>
+      </w:pPr>
+    </w:lvl>
+    <w:lvl w:ilvl="4" w:tplc="04090019" w:tentative="1">
+      <w:start w:val="1"/>
+      <w:numFmt w:val="lowerLetter"/>
+      <w:lvlText w:val="%5."/>
+      <w:lvlJc w:val="left"/>
+      <w:pPr>
+        <w:ind w:left="3600" w:hanging="360"/>
+      </w:pPr>
+    </w:lvl>
+    <w:lvl w:ilvl="5" w:tplc="0409001B" w:tentative="1">
+      <w:start w:val="1"/>
+      <w:numFmt w:val="lowerRoman"/>
+      <w:lvlText w:val="%6."/>
+      <w:lvlJc w:val="right"/>
+      <w:pPr>
+        <w:ind w:left="4320" w:hanging="180"/>
+      </w:pPr>
+    </w:lvl>
+    <w:lvl w:ilvl="6" w:tplc="0409000F" w:tentative="1">
+      <w:start w:val="1"/>
+      <w:numFmt w:val="decimal"/>
+      <w:lvlText w:val="%7."/>
+      <w:lvlJc w:val="left"/>
+      <w:pPr>
+        <w:ind w:left="5040" w:hanging="360"/>
+      </w:pPr>
+    </w:lvl>
+    <w:lvl w:ilvl="7" w:tplc="04090019" w:tentative="1">
+      <w:start w:val="1"/>
+      <w:numFmt w:val="lowerLetter"/>
+      <w:lvlText w:val="%8."/>
+      <w:lvlJc w:val="left"/>
+      <w:pPr>
+        <w:ind w:left="5760" w:hanging="360"/>
+      </w:pPr>
+    </w:lvl>
+    <w:lvl w:ilvl="8" w:tplc="0409001B" w:tentative="1">
+      <w:start w:val="1"/>
+      <w:numFmt w:val="lowerRoman"/>
+      <w:lvlText w:val="%9."/>
+      <w:lvlJc w:val="right"/>
+      <w:pPr>
+        <w:ind w:left="6480" w:hanging="180"/>
+      </w:pPr>
+    </w:lvl>
+  </w:abstractNum>
+  <w:abstractNum w:abstractNumId="13" w15:restartNumberingAfterBreak="0">
+    <w:nsid w:val="64E853E2"/>
+    <w:multiLevelType w:val="hybridMultilevel"/>
+    <w:tmpl w:val="76761D26"/>
+    <w:lvl w:ilvl="0" w:tplc="0409000F">
+      <w:start w:val="1"/>
+      <w:numFmt w:val="decimal"/>
+      <w:lvlText w:val="%1."/>
+      <w:lvlJc w:val="left"/>
+      <w:pPr>
+        <w:ind w:left="720" w:hanging="360"/>
+      </w:pPr>
+    </w:lvl>
+    <w:lvl w:ilvl="1" w:tplc="04090019" w:tentative="1">
+      <w:start w:val="1"/>
+      <w:numFmt w:val="lowerLetter"/>
+      <w:lvlText w:val="%2."/>
+      <w:lvlJc w:val="left"/>
+      <w:pPr>
+        <w:ind w:left="1440" w:hanging="360"/>
+      </w:pPr>
+    </w:lvl>
+    <w:lvl w:ilvl="2" w:tplc="0409001B" w:tentative="1">
+      <w:start w:val="1"/>
+      <w:numFmt w:val="lowerRoman"/>
+      <w:lvlText w:val="%3."/>
+      <w:lvlJc w:val="right"/>
+      <w:pPr>
+        <w:ind w:left="2160" w:hanging="180"/>
+      </w:pPr>
+    </w:lvl>
+    <w:lvl w:ilvl="3" w:tplc="0409000F" w:tentative="1">
+      <w:start w:val="1"/>
+      <w:numFmt w:val="decimal"/>
+      <w:lvlText w:val="%4."/>
+      <w:lvlJc w:val="left"/>
+      <w:pPr>
+        <w:ind w:left="2880" w:hanging="360"/>
+      </w:pPr>
+    </w:lvl>
+    <w:lvl w:ilvl="4" w:tplc="04090019" w:tentative="1">
+      <w:start w:val="1"/>
+      <w:numFmt w:val="lowerLetter"/>
+      <w:lvlText w:val="%5."/>
+      <w:lvlJc w:val="left"/>
+      <w:pPr>
+        <w:ind w:left="3600" w:hanging="360"/>
+      </w:pPr>
+    </w:lvl>
+    <w:lvl w:ilvl="5" w:tplc="0409001B" w:tentative="1">
+      <w:start w:val="1"/>
+      <w:numFmt w:val="lowerRoman"/>
+      <w:lvlText w:val="%6."/>
+      <w:lvlJc w:val="right"/>
+      <w:pPr>
+        <w:ind w:left="4320" w:hanging="180"/>
+      </w:pPr>
+    </w:lvl>
+    <w:lvl w:ilvl="6" w:tplc="0409000F" w:tentative="1">
+      <w:start w:val="1"/>
+      <w:numFmt w:val="decimal"/>
+      <w:lvlText w:val="%7."/>
+      <w:lvlJc w:val="left"/>
+      <w:pPr>
+        <w:ind w:left="5040" w:hanging="360"/>
+      </w:pPr>
+    </w:lvl>
+    <w:lvl w:ilvl="7" w:tplc="04090019" w:tentative="1">
+      <w:start w:val="1"/>
+      <w:numFmt w:val="lowerLetter"/>
+      <w:lvlText w:val="%8."/>
+      <w:lvlJc w:val="left"/>
+      <w:pPr>
+        <w:ind w:left="5760" w:hanging="360"/>
+      </w:pPr>
+    </w:lvl>
+    <w:lvl w:ilvl="8" w:tplc="0409001B" w:tentative="1">
+      <w:start w:val="1"/>
+      <w:numFmt w:val="lowerRoman"/>
+      <w:lvlText w:val="%9."/>
+      <w:lvlJc w:val="right"/>
+      <w:pPr>
+        <w:ind w:left="6480" w:hanging="180"/>
+      </w:pPr>
+    </w:lvl>
+  </w:abstractNum>
+  <w:abstractNum w:abstractNumId="14" w15:restartNumberingAfterBreak="0">
     <w:nsid w:val="65DA3A95"/>
     <w:multiLevelType w:val="hybridMultilevel"/>
     <w:tmpl w:val="54F6C8BE"/>
@@ -5947,7 +6855,7 @@
       </w:pPr>
     </w:lvl>
   </w:abstractNum>
-  <w:abstractNum w:abstractNumId="10" w15:restartNumberingAfterBreak="0">
+  <w:abstractNum w:abstractNumId="15" w15:restartNumberingAfterBreak="0">
     <w:nsid w:val="6C596F4D"/>
     <w:multiLevelType w:val="hybridMultilevel"/>
     <w:tmpl w:val="4DAE959C"/>
@@ -6033,7 +6941,7 @@
       </w:pPr>
     </w:lvl>
   </w:abstractNum>
-  <w:abstractNum w:abstractNumId="11" w15:restartNumberingAfterBreak="0">
+  <w:abstractNum w:abstractNumId="16" w15:restartNumberingAfterBreak="0">
     <w:nsid w:val="76E04F6B"/>
     <w:multiLevelType w:val="hybridMultilevel"/>
     <w:tmpl w:val="16BEE4AC"/>
@@ -6301,7 +7209,7 @@
     </w:lvl>
   </w:abstractNum>
   <w:num w:numId="1" w16cid:durableId="712391740">
-    <w:abstractNumId w:val="3"/>
+    <w:abstractNumId w:val="4"/>
   </w:num>
   <w:num w:numId="2" w16cid:durableId="515772300">
     <w:abstractNumId w:val="2"/>
@@ -6331,52 +7239,67 @@
     </w:lvlOverride>
   </w:num>
   <w:num w:numId="7" w16cid:durableId="1104230879">
-    <w:abstractNumId w:val="11"/>
+    <w:abstractNumId w:val="16"/>
   </w:num>
   <w:num w:numId="8" w16cid:durableId="1368796756">
-    <w:abstractNumId w:val="5"/>
+    <w:abstractNumId w:val="8"/>
   </w:num>
   <w:num w:numId="9" w16cid:durableId="474183853">
-    <w:abstractNumId w:val="5"/>
+    <w:abstractNumId w:val="8"/>
     <w:lvlOverride w:ilvl="0">
       <w:startOverride w:val="1"/>
     </w:lvlOverride>
   </w:num>
   <w:num w:numId="10" w16cid:durableId="1766926439">
-    <w:abstractNumId w:val="5"/>
+    <w:abstractNumId w:val="8"/>
     <w:lvlOverride w:ilvl="0">
       <w:startOverride w:val="1"/>
     </w:lvlOverride>
   </w:num>
   <w:num w:numId="11" w16cid:durableId="975376372">
-    <w:abstractNumId w:val="5"/>
+    <w:abstractNumId w:val="8"/>
     <w:lvlOverride w:ilvl="0">
       <w:startOverride w:val="1"/>
     </w:lvlOverride>
   </w:num>
   <w:num w:numId="12" w16cid:durableId="326984758">
-    <w:abstractNumId w:val="7"/>
+    <w:abstractNumId w:val="10"/>
   </w:num>
   <w:num w:numId="13" w16cid:durableId="168565284">
     <w:abstractNumId w:val="0"/>
   </w:num>
   <w:num w:numId="14" w16cid:durableId="606736542">
-    <w:abstractNumId w:val="9"/>
+    <w:abstractNumId w:val="14"/>
   </w:num>
   <w:num w:numId="15" w16cid:durableId="2056390029">
     <w:abstractNumId w:val="1"/>
   </w:num>
   <w:num w:numId="16" w16cid:durableId="1368870371">
-    <w:abstractNumId w:val="4"/>
+    <w:abstractNumId w:val="5"/>
   </w:num>
   <w:num w:numId="17" w16cid:durableId="1442258096">
-    <w:abstractNumId w:val="8"/>
+    <w:abstractNumId w:val="11"/>
   </w:num>
   <w:num w:numId="18" w16cid:durableId="1783920727">
-    <w:abstractNumId w:val="10"/>
+    <w:abstractNumId w:val="15"/>
   </w:num>
   <w:num w:numId="19" w16cid:durableId="1097798071">
+    <w:abstractNumId w:val="9"/>
+  </w:num>
+  <w:num w:numId="20" w16cid:durableId="1160342572">
     <w:abstractNumId w:val="6"/>
+  </w:num>
+  <w:num w:numId="21" w16cid:durableId="785732150">
+    <w:abstractNumId w:val="7"/>
+  </w:num>
+  <w:num w:numId="22" w16cid:durableId="644510371">
+    <w:abstractNumId w:val="3"/>
+  </w:num>
+  <w:num w:numId="23" w16cid:durableId="305626412">
+    <w:abstractNumId w:val="13"/>
+  </w:num>
+  <w:num w:numId="24" w16cid:durableId="945498106">
+    <w:abstractNumId w:val="12"/>
   </w:num>
 </w:numbering>
 </file>

</xml_diff>